<commit_message>
fixed report screen not showing  scans from files
</commit_message>
<xml_diff>
--- a/SecureAssist_Paper.docx
+++ b/SecureAssist_Paper.docx
@@ -132,7 +132,7 @@
           <w:left w:w="10" w:type="dxa"/>
           <w:right w:w="10" w:type="dxa"/>
         </w:tblCellMar>
-        <w:tblLook w:val="0000" w:firstRow="0" w:lastRow="0" w:firstColumn="0" w:lastColumn="0" w:noHBand="0" w:noVBand="0"/>
+        <w:tblLook w:val="04A0" w:firstRow="1" w:lastRow="0" w:firstColumn="1" w:lastColumn="0" w:noHBand="0" w:noVBand="1"/>
       </w:tblPr>
       <w:tblGrid>
         <w:gridCol w:w="1500"/>
@@ -1726,7 +1726,7 @@
           <w:left w:w="10" w:type="dxa"/>
           <w:right w:w="10" w:type="dxa"/>
         </w:tblCellMar>
-        <w:tblLook w:val="0000" w:firstRow="0" w:lastRow="0" w:firstColumn="0" w:lastColumn="0" w:noHBand="0" w:noVBand="0"/>
+        <w:tblLook w:val="04A0" w:firstRow="1" w:lastRow="0" w:firstColumn="1" w:lastColumn="0" w:noHBand="0" w:noVBand="1"/>
       </w:tblPr>
       <w:tblGrid>
         <w:gridCol w:w="1900"/>
@@ -3411,7 +3411,7 @@
           <w:left w:w="10" w:type="dxa"/>
           <w:right w:w="10" w:type="dxa"/>
         </w:tblCellMar>
-        <w:tblLook w:val="0000" w:firstRow="0" w:lastRow="0" w:firstColumn="0" w:lastColumn="0" w:noHBand="0" w:noVBand="0"/>
+        <w:tblLook w:val="04A0" w:firstRow="1" w:lastRow="0" w:firstColumn="1" w:lastColumn="0" w:noHBand="0" w:noVBand="1"/>
       </w:tblPr>
       <w:tblGrid>
         <w:gridCol w:w="2300"/>
@@ -4083,7 +4083,7 @@
           <w:left w:w="10" w:type="dxa"/>
           <w:right w:w="10" w:type="dxa"/>
         </w:tblCellMar>
-        <w:tblLook w:val="0000" w:firstRow="0" w:lastRow="0" w:firstColumn="0" w:lastColumn="0" w:noHBand="0" w:noVBand="0"/>
+        <w:tblLook w:val="04A0" w:firstRow="1" w:lastRow="0" w:firstColumn="1" w:lastColumn="0" w:noHBand="0" w:noVBand="1"/>
       </w:tblPr>
       <w:tblGrid>
         <w:gridCol w:w="3000"/>
@@ -6174,7 +6174,7 @@
           <w:left w:w="10" w:type="dxa"/>
           <w:right w:w="10" w:type="dxa"/>
         </w:tblCellMar>
-        <w:tblLook w:val="0000" w:firstRow="0" w:lastRow="0" w:firstColumn="0" w:lastColumn="0" w:noHBand="0" w:noVBand="0"/>
+        <w:tblLook w:val="04A0" w:firstRow="1" w:lastRow="0" w:firstColumn="1" w:lastColumn="0" w:noHBand="0" w:noVBand="1"/>
       </w:tblPr>
       <w:tblGrid>
         <w:gridCol w:w="2350"/>
@@ -8351,7 +8351,7 @@
           <w:left w:w="10" w:type="dxa"/>
           <w:right w:w="10" w:type="dxa"/>
         </w:tblCellMar>
-        <w:tblLook w:val="0000" w:firstRow="0" w:lastRow="0" w:firstColumn="0" w:lastColumn="0" w:noHBand="0" w:noVBand="0"/>
+        <w:tblLook w:val="04A0" w:firstRow="1" w:lastRow="0" w:firstColumn="1" w:lastColumn="0" w:noHBand="0" w:noVBand="1"/>
       </w:tblPr>
       <w:tblGrid>
         <w:gridCol w:w="2600"/>
@@ -9096,7 +9096,7 @@
           <w:left w:w="10" w:type="dxa"/>
           <w:right w:w="10" w:type="dxa"/>
         </w:tblCellMar>
-        <w:tblLook w:val="0000" w:firstRow="0" w:lastRow="0" w:firstColumn="0" w:lastColumn="0" w:noHBand="0" w:noVBand="0"/>
+        <w:tblLook w:val="04A0" w:firstRow="1" w:lastRow="0" w:firstColumn="1" w:lastColumn="0" w:noHBand="0" w:noVBand="1"/>
       </w:tblPr>
       <w:tblGrid>
         <w:gridCol w:w="2600"/>
@@ -9660,10 +9660,58 @@
         <w:spacing w:after="130" w:line="278" w:lineRule="auto"/>
       </w:pPr>
       <w:r>
-        <w:t>The Juliet Test Suite is NIST's reference corpus for C and C++ static analysis. Evaluation is restricted to intra-procedural flow variants, matching the analyzer's single-file design, and to test-case families absent from the model's training corpu</w:t>
-      </w:r>
-      <w:r>
-        <w:t>s. 969 function-level cases remain.</w:t>
+        <w:t>The Juliet Test Suite is NIST's reference corpus for C and C++ static analysis. Evaluation is restricted to flow variants 01–21, in which the data flow is contained within a single function, and to test-case families absent from the model's trainin</w:t>
+      </w:r>
+      <w:r>
+        <w:t>g corpus. 969 function-level cases remain.</w:t>
+      </w:r>
+    </w:p>
+    <w:p>
+      <w:pPr>
+        <w:bidi w:val="0"/>
+        <w:spacing w:before="70" w:after="190"/>
+      </w:pPr>
+      <w:r>
+        <w:rPr>
+          <w:i/>
+          <w:iCs/>
+          <w:color w:val="444444"/>
+          <w:sz w:val="18"/>
+          <w:szCs w:val="18"/>
+        </w:rPr>
+        <w:t xml:space="preserve">This scoping is conservative rather than exact. The analyzer resolves </w:t>
+      </w:r>
+      <w:proofErr w:type="gramStart"/>
+      <w:r>
+        <w:rPr>
+          <w:i/>
+          <w:iCs/>
+          <w:color w:val="444444"/>
+          <w:sz w:val="18"/>
+          <w:szCs w:val="18"/>
+        </w:rPr>
+        <w:t>calls</w:t>
+      </w:r>
+      <w:proofErr w:type="gramEnd"/>
+      <w:r>
+        <w:rPr>
+          <w:i/>
+          <w:iCs/>
+          <w:color w:val="444444"/>
+          <w:sz w:val="18"/>
+          <w:szCs w:val="18"/>
+        </w:rPr>
+        <w:t xml:space="preserve"> to functions defined in the same file, so Juliet's same-file cross-function variants are not beyond its design; they were excluded to kee</w:t>
+      </w:r>
+      <w:r>
+        <w:rPr>
+          <w:i/>
+          <w:iCs/>
+          <w:color w:val="444444"/>
+          <w:sz w:val="18"/>
+          <w:szCs w:val="18"/>
+        </w:rPr>
+        <w:t>p the measured set homogeneous, and the reported figures therefore say nothing about them either way. Variants that split the flow across separate source files are genuinely out of scope.</w:t>
       </w:r>
     </w:p>
     <w:p>
@@ -9697,7 +9745,7 @@
           <w:left w:w="10" w:type="dxa"/>
           <w:right w:w="10" w:type="dxa"/>
         </w:tblCellMar>
-        <w:tblLook w:val="0000" w:firstRow="0" w:lastRow="0" w:firstColumn="0" w:lastColumn="0" w:noHBand="0" w:noVBand="0"/>
+        <w:tblLook w:val="04A0" w:firstRow="1" w:lastRow="0" w:firstColumn="1" w:lastColumn="0" w:noHBand="0" w:noVBand="1"/>
       </w:tblPr>
       <w:tblGrid>
         <w:gridCol w:w="2350"/>
@@ -9852,7 +9900,17 @@
                 <w:sz w:val="18"/>
                 <w:szCs w:val="18"/>
               </w:rPr>
-              <w:t>Youden</w:t>
+              <w:t>You</w:t>
+            </w:r>
+            <w:r>
+              <w:rPr>
+                <w:b/>
+                <w:bCs/>
+                <w:color w:val="FFFFFF"/>
+                <w:sz w:val="18"/>
+                <w:szCs w:val="18"/>
+              </w:rPr>
+              <w:t>den</w:t>
             </w:r>
           </w:p>
         </w:tc>
@@ -11675,7 +11733,10 @@
         <w:spacing w:after="130" w:line="278" w:lineRule="auto"/>
       </w:pPr>
       <w:r>
-        <w:t>Use-after-free is detected at 94.4% with no false positives whatsoever. Memory-bounds categories are weaker, which is expected: out-of-bounds writes require tracking buffer sizes and pointer arithmetic, analysis a lightweight taint model does not perform.</w:t>
+        <w:t>Use-after-free is detected at 94.4% with no false positives whatsoever. Memory-boun</w:t>
+      </w:r>
+      <w:r>
+        <w:t>ds categories are weaker, which is expected: out-of-bounds writes require tracking buffer sizes and pointer arithmetic, analysis a lightweight taint model does not perform.</w:t>
       </w:r>
     </w:p>
     <w:p>
@@ -11751,8 +11812,6 @@
       <w:pPr>
         <w:pStyle w:val="Heading2"/>
         <w:spacing w:before="260" w:after="110"/>
-      </w:pPr>
-      <w:r>
         <w:rPr>
           <w:b/>
           <w:bCs/>
@@ -11760,6 +11819,61 @@
           <w:sz w:val="24"/>
           <w:szCs w:val="24"/>
         </w:rPr>
+      </w:pPr>
+    </w:p>
+    <w:p>
+      <w:pPr>
+        <w:pStyle w:val="Heading2"/>
+        <w:spacing w:before="260" w:after="110"/>
+        <w:rPr>
+          <w:b/>
+          <w:bCs/>
+          <w:color w:val="1F4E79"/>
+          <w:sz w:val="24"/>
+          <w:szCs w:val="24"/>
+        </w:rPr>
+      </w:pPr>
+    </w:p>
+    <w:p>
+      <w:pPr>
+        <w:pStyle w:val="Heading2"/>
+        <w:spacing w:before="260" w:after="110"/>
+        <w:rPr>
+          <w:b/>
+          <w:bCs/>
+          <w:color w:val="1F4E79"/>
+          <w:sz w:val="24"/>
+          <w:szCs w:val="24"/>
+        </w:rPr>
+      </w:pPr>
+    </w:p>
+    <w:p>
+      <w:pPr>
+        <w:pStyle w:val="Heading2"/>
+        <w:spacing w:before="260" w:after="110"/>
+        <w:rPr>
+          <w:b/>
+          <w:bCs/>
+          <w:color w:val="1F4E79"/>
+          <w:sz w:val="24"/>
+          <w:szCs w:val="24"/>
+        </w:rPr>
+      </w:pPr>
+    </w:p>
+    <w:p>
+      <w:pPr>
+        <w:pStyle w:val="Heading2"/>
+        <w:spacing w:before="260" w:after="110"/>
+      </w:pPr>
+      <w:r>
+        <w:rPr>
+          <w:b/>
+          <w:bCs/>
+          <w:color w:val="1F4E79"/>
+          <w:sz w:val="24"/>
+          <w:szCs w:val="24"/>
+        </w:rPr>
+        <w:lastRenderedPageBreak/>
         <w:t>5.2 Comparison with published results</w:t>
       </w:r>
     </w:p>
@@ -11790,7 +11904,7 @@
           <w:left w:w="10" w:type="dxa"/>
           <w:right w:w="10" w:type="dxa"/>
         </w:tblCellMar>
-        <w:tblLook w:val="0000" w:firstRow="0" w:lastRow="0" w:firstColumn="0" w:lastColumn="0" w:noHBand="0" w:noVBand="0"/>
+        <w:tblLook w:val="04A0" w:firstRow="1" w:lastRow="0" w:firstColumn="1" w:lastColumn="0" w:noHBand="0" w:noVBand="1"/>
       </w:tblPr>
       <w:tblGrid>
         <w:gridCol w:w="3400"/>
@@ -12635,7 +12749,6 @@
                 <w:sz w:val="18"/>
                 <w:szCs w:val="18"/>
               </w:rPr>
-              <w:lastRenderedPageBreak/>
               <w:t>SecureAssist</w:t>
             </w:r>
             <w:proofErr w:type="spellEnd"/>
@@ -12801,7 +12914,7 @@
           <w:left w:w="10" w:type="dxa"/>
           <w:right w:w="10" w:type="dxa"/>
         </w:tblCellMar>
-        <w:tblLook w:val="0000" w:firstRow="0" w:lastRow="0" w:firstColumn="0" w:lastColumn="0" w:noHBand="0" w:noVBand="0"/>
+        <w:tblLook w:val="04A0" w:firstRow="1" w:lastRow="0" w:firstColumn="1" w:lastColumn="0" w:noHBand="0" w:noVBand="1"/>
       </w:tblPr>
       <w:tblGrid>
         <w:gridCol w:w="1750"/>
@@ -13943,7 +14056,7 @@
           <w:left w:w="10" w:type="dxa"/>
           <w:right w:w="10" w:type="dxa"/>
         </w:tblCellMar>
-        <w:tblLook w:val="0000" w:firstRow="0" w:lastRow="0" w:firstColumn="0" w:lastColumn="0" w:noHBand="0" w:noVBand="0"/>
+        <w:tblLook w:val="04A0" w:firstRow="1" w:lastRow="0" w:firstColumn="1" w:lastColumn="0" w:noHBand="0" w:noVBand="1"/>
       </w:tblPr>
       <w:tblGrid>
         <w:gridCol w:w="4200"/>
@@ -15162,34 +15275,7 @@
           <w:szCs w:val="29"/>
         </w:rPr>
         <w:lastRenderedPageBreak/>
-        <w:t xml:space="preserve">8. Known </w:t>
-      </w:r>
-      <w:r>
-        <w:rPr>
-          <w:b/>
-          <w:bCs/>
-          <w:color w:val="1F4E79"/>
-          <w:sz w:val="29"/>
-          <w:szCs w:val="29"/>
-        </w:rPr>
-        <w:t>Limitations</w:t>
-      </w:r>
-      <w:r>
-        <w:rPr>
-          <w:b/>
-          <w:bCs/>
-        </w:rPr>
-        <w:t xml:space="preserve"> </w:t>
-      </w:r>
-      <w:r>
-        <w:rPr>
-          <w:b/>
-          <w:bCs/>
-          <w:color w:val="2F5496" w:themeColor="accent1" w:themeShade="BF"/>
-          <w:sz w:val="29"/>
-          <w:szCs w:val="29"/>
-        </w:rPr>
-        <w:t>(and future work)</w:t>
+        <w:t>8. Known Limitations</w:t>
       </w:r>
     </w:p>
     <w:p>
@@ -15202,10 +15288,13 @@
         <w:spacing w:after="80"/>
       </w:pPr>
       <w:r>
-        <w:t>Single-file and intra-procedural — taint is not followed across function or file boundaries. Juliet inter-procedu</w:t>
-      </w:r>
-      <w:r>
-        <w:t>ral variants are out of scope and this is disclosed.</w:t>
+        <w:t>Single-file — taint is not followed across file boundaries. Within a file the analysis does cross function bounda</w:t>
+      </w:r>
+      <w:r>
+        <w:t>ries: formal parameters are seeded as untrusted and removed again only where a guard validates them, and a call to a function defined in the same file is resolved by checking whether its return statements yield tainted values under the current taint state.</w:t>
+      </w:r>
+      <w:r>
+        <w:t xml:space="preserve"> Flow that leaves the file is not modelled, so Juliet's cross-file variants are out of scope and this is disclosed.</w:t>
       </w:r>
     </w:p>
     <w:p>
@@ -15218,7 +15307,10 @@
         <w:spacing w:after="80"/>
       </w:pPr>
       <w:r>
-        <w:t xml:space="preserve">No reflective dispatch modelling — 80% of OWASP false positives stem from reflective indirection, which is intractable without whole-program analysis of the class implemented by </w:t>
+        <w:t>No reflective dispatch modelling — 80% of OWASP false positives stem from reflective indirection, which is intractable without whole-program</w:t>
+      </w:r>
+      <w:r>
+        <w:t xml:space="preserve"> analysis of the class implemented by </w:t>
       </w:r>
       <w:proofErr w:type="spellStart"/>
       <w:r>
@@ -15239,10 +15331,7 @@
         <w:spacing w:after="80"/>
       </w:pPr>
       <w:r>
-        <w:t>Fiel</w:t>
-      </w:r>
-      <w:r>
-        <w:t>d-insensitive collections — a collection is treated as tainted once any tainted value enters it. A further 10% of false positives.</w:t>
+        <w:t>Field-insensitive collections — a collection is treated as tainted once any tainted value enters it. A further 10% of false positives.</w:t>
       </w:r>
     </w:p>
     <w:p>
@@ -15255,7 +15344,10 @@
         <w:spacing w:after="80"/>
       </w:pPr>
       <w:r>
-        <w:t>Path-insensitive — branch feasibility and constant propagation are not evaluated. A further 10%.</w:t>
+        <w:t>Path-insensitive — branch feasibility and constant propagation</w:t>
+      </w:r>
+      <w:r>
+        <w:t xml:space="preserve"> are not evaluated. A further 10%.</w:t>
       </w:r>
     </w:p>
     <w:p>
@@ -15268,10 +15360,7 @@
         <w:spacing w:after="80"/>
       </w:pPr>
       <w:r>
-        <w:t>No buffer-size analysis — si</w:t>
-      </w:r>
-      <w:r>
-        <w:t xml:space="preserve">ze-mismatch overflows such as </w:t>
+        <w:t xml:space="preserve">No buffer-size analysis — size-mismatch overflows such as </w:t>
       </w:r>
       <w:proofErr w:type="spellStart"/>
       <w:r>
@@ -15321,10 +15410,10 @@
         <w:spacing w:after="80"/>
       </w:pPr>
       <w:r>
-        <w:t>The model is not a</w:t>
-      </w:r>
-      <w:r>
-        <w:t>n independent detector in the configuration measured here; it receives the analyzer's findings as input. A standalone measurement would require a separate evaluation.</w:t>
+        <w:t>The model is not an independent detector in the configuration measured here; it receives the analyzer's findings as input. A standalone measurement w</w:t>
+      </w:r>
+      <w:r>
+        <w:t>ould require a separate evaluation.</w:t>
       </w:r>
     </w:p>
     <w:p>
@@ -15354,203 +15443,11 @@
         <w:spacing w:after="130" w:line="278" w:lineRule="auto"/>
       </w:pPr>
       <w:r>
-        <w:t>Approximately 20% of observed false positives are addressable with field-sensitive container modelling and constant propagation, both well</w:t>
-      </w:r>
-      <w:r>
-        <w:t>-understood techniques. The remaining 80% require whole-program reflection analysis representing years of dedicated engineering.</w:t>
-      </w:r>
-    </w:p>
-    <w:p>
-      <w:pPr>
-        <w:pStyle w:val="Heading1"/>
-        <w:pBdr>
-          <w:bottom w:val="single" w:sz="6" w:space="4" w:color="1F4E79"/>
-        </w:pBdr>
-        <w:spacing w:before="340" w:after="150"/>
-        <w:rPr>
-          <w:b/>
-          <w:bCs/>
-          <w:color w:val="1F4E79"/>
-          <w:sz w:val="29"/>
-          <w:szCs w:val="29"/>
-        </w:rPr>
-      </w:pPr>
-    </w:p>
-    <w:p>
-      <w:pPr>
-        <w:pStyle w:val="Heading1"/>
-        <w:pBdr>
-          <w:bottom w:val="single" w:sz="6" w:space="4" w:color="1F4E79"/>
-        </w:pBdr>
-        <w:spacing w:before="340" w:after="150"/>
-        <w:rPr>
-          <w:b/>
-          <w:bCs/>
-          <w:color w:val="1F4E79"/>
-          <w:sz w:val="29"/>
-          <w:szCs w:val="29"/>
-        </w:rPr>
-      </w:pPr>
-    </w:p>
-    <w:p>
-      <w:pPr>
-        <w:pStyle w:val="Heading1"/>
-        <w:pBdr>
-          <w:bottom w:val="single" w:sz="6" w:space="4" w:color="1F4E79"/>
-        </w:pBdr>
-        <w:spacing w:before="340" w:after="150"/>
-        <w:rPr>
-          <w:b/>
-          <w:bCs/>
-          <w:color w:val="1F4E79"/>
-          <w:sz w:val="29"/>
-          <w:szCs w:val="29"/>
-        </w:rPr>
-      </w:pPr>
-    </w:p>
-    <w:p>
-      <w:pPr>
-        <w:pStyle w:val="Heading1"/>
-        <w:pBdr>
-          <w:bottom w:val="single" w:sz="6" w:space="4" w:color="1F4E79"/>
-        </w:pBdr>
-        <w:spacing w:before="340" w:after="150"/>
-        <w:rPr>
-          <w:b/>
-          <w:bCs/>
-          <w:color w:val="1F4E79"/>
-          <w:sz w:val="29"/>
-          <w:szCs w:val="29"/>
-        </w:rPr>
-      </w:pPr>
-    </w:p>
-    <w:p>
-      <w:pPr>
-        <w:pStyle w:val="Heading1"/>
-        <w:pBdr>
-          <w:bottom w:val="single" w:sz="6" w:space="4" w:color="1F4E79"/>
-        </w:pBdr>
-        <w:spacing w:before="340" w:after="150"/>
-        <w:rPr>
-          <w:b/>
-          <w:bCs/>
-          <w:color w:val="1F4E79"/>
-          <w:sz w:val="29"/>
-          <w:szCs w:val="29"/>
-        </w:rPr>
-      </w:pPr>
-    </w:p>
-    <w:p>
-      <w:pPr>
-        <w:pStyle w:val="Heading1"/>
-        <w:pBdr>
-          <w:bottom w:val="single" w:sz="6" w:space="4" w:color="1F4E79"/>
-        </w:pBdr>
-        <w:spacing w:before="340" w:after="150"/>
-        <w:rPr>
-          <w:b/>
-          <w:bCs/>
-          <w:color w:val="1F4E79"/>
-          <w:sz w:val="29"/>
-          <w:szCs w:val="29"/>
-        </w:rPr>
-      </w:pPr>
-    </w:p>
-    <w:p>
-      <w:pPr>
-        <w:pStyle w:val="Heading1"/>
-        <w:pBdr>
-          <w:bottom w:val="single" w:sz="6" w:space="4" w:color="1F4E79"/>
-        </w:pBdr>
-        <w:spacing w:before="340" w:after="150"/>
-        <w:rPr>
-          <w:b/>
-          <w:bCs/>
-          <w:color w:val="1F4E79"/>
-          <w:sz w:val="29"/>
-          <w:szCs w:val="29"/>
-        </w:rPr>
-      </w:pPr>
-    </w:p>
-    <w:p>
-      <w:pPr>
-        <w:pStyle w:val="Heading1"/>
-        <w:pBdr>
-          <w:bottom w:val="single" w:sz="6" w:space="4" w:color="1F4E79"/>
-        </w:pBdr>
-        <w:spacing w:before="340" w:after="150"/>
-        <w:rPr>
-          <w:b/>
-          <w:bCs/>
-          <w:color w:val="1F4E79"/>
-          <w:sz w:val="29"/>
-          <w:szCs w:val="29"/>
-        </w:rPr>
-      </w:pPr>
-    </w:p>
-    <w:p>
-      <w:pPr>
-        <w:pStyle w:val="Heading1"/>
-        <w:pBdr>
-          <w:bottom w:val="single" w:sz="6" w:space="4" w:color="1F4E79"/>
-        </w:pBdr>
-        <w:spacing w:before="340" w:after="150"/>
-        <w:rPr>
-          <w:b/>
-          <w:bCs/>
-          <w:color w:val="1F4E79"/>
-          <w:sz w:val="29"/>
-          <w:szCs w:val="29"/>
-        </w:rPr>
-      </w:pPr>
-    </w:p>
-    <w:p>
-      <w:pPr>
-        <w:pStyle w:val="Heading1"/>
-        <w:pBdr>
-          <w:bottom w:val="single" w:sz="6" w:space="4" w:color="1F4E79"/>
-        </w:pBdr>
-        <w:spacing w:before="340" w:after="150"/>
-        <w:rPr>
-          <w:b/>
-          <w:bCs/>
-          <w:color w:val="1F4E79"/>
-          <w:sz w:val="29"/>
-          <w:szCs w:val="29"/>
-        </w:rPr>
-      </w:pPr>
-    </w:p>
-    <w:p>
-      <w:pPr>
-        <w:pStyle w:val="Heading1"/>
-        <w:pBdr>
-          <w:bottom w:val="single" w:sz="6" w:space="4" w:color="1F4E79"/>
-        </w:pBdr>
-        <w:spacing w:before="340" w:after="150"/>
-        <w:rPr>
-          <w:b/>
-          <w:bCs/>
-          <w:color w:val="1F4E79"/>
-          <w:sz w:val="29"/>
-          <w:szCs w:val="29"/>
-        </w:rPr>
-      </w:pPr>
-    </w:p>
-    <w:p>
-      <w:pPr>
-        <w:pStyle w:val="Heading1"/>
-        <w:pBdr>
-          <w:bottom w:val="single" w:sz="6" w:space="4" w:color="1F4E79"/>
-        </w:pBdr>
-        <w:spacing w:before="340" w:after="150"/>
-        <w:rPr>
-          <w:b/>
-          <w:bCs/>
-          <w:color w:val="1F4E79"/>
-          <w:sz w:val="29"/>
-          <w:szCs w:val="29"/>
-        </w:rPr>
-      </w:pPr>
+        <w:t>Approximately 20% of observed false positives are addressable with field-sensitive container modelling</w:t>
+      </w:r>
+      <w:r>
+        <w:t xml:space="preserve"> and constant propagation, both well-understood techniques. The remaining 80% require whole-program reflection analysis representing years of dedicated engineering.</w:t>
+      </w:r>
     </w:p>
     <w:p>
       <w:pPr>
@@ -15568,8 +15465,16 @@
           <w:sz w:val="29"/>
           <w:szCs w:val="29"/>
         </w:rPr>
-        <w:lastRenderedPageBreak/>
         <w:t>9. Sources</w:t>
+      </w:r>
+    </w:p>
+    <w:p>
+      <w:pPr>
+        <w:bidi w:val="0"/>
+        <w:spacing w:after="130" w:line="278" w:lineRule="auto"/>
+      </w:pPr>
+      <w:r>
+        <w:t>All links accessed 4 August 2026.</w:t>
       </w:r>
     </w:p>
     <w:p>
@@ -15602,14 +15507,14 @@
           <w:sz w:val="20"/>
           <w:szCs w:val="20"/>
         </w:rPr>
-        <w:t>OWASP Foundation. OWASP Benchmark Project, version 1.2. Jav</w:t>
+        <w:t>OWASP Foundation. OWASP</w:t>
       </w:r>
       <w:r>
         <w:rPr>
           <w:sz w:val="20"/>
           <w:szCs w:val="20"/>
         </w:rPr>
-        <w:t xml:space="preserve">a test suite of 2,740 cases with published expected results. </w:t>
+        <w:t xml:space="preserve"> Benchmark Project, version 1.2. Java test suite of 2,740 cases with published expected results. </w:t>
       </w:r>
       <w:hyperlink r:id="rId5" w:history="1">
         <w:r>
@@ -15637,14 +15542,14 @@
           <w:sz w:val="20"/>
           <w:szCs w:val="20"/>
         </w:rPr>
-        <w:t>National Institute of Standards and Technology. Juliet Test Suite for C/C++, version 1.3. NIST So</w:t>
+        <w:t>National Institute of Standards and Technology. Juliet Test S</w:t>
       </w:r>
       <w:r>
         <w:rPr>
           <w:sz w:val="20"/>
           <w:szCs w:val="20"/>
         </w:rPr>
-        <w:t xml:space="preserve">ftware Assurance Reference Dataset (SARD), Test Suite 112. </w:t>
+        <w:t xml:space="preserve">uite for C/C++, version 1.3. NIST Software Assurance Reference Dataset (SARD), Test Suite 112. </w:t>
       </w:r>
       <w:hyperlink r:id="rId6" w:history="1">
         <w:r>
@@ -16040,6 +15945,7 @@
           <w:sz w:val="20"/>
           <w:szCs w:val="20"/>
         </w:rPr>
+        <w:lastRenderedPageBreak/>
         <w:t>A Systematic Literature Review on Static Application Security Testing (SAST) Tools: Evaluation, Benchmarks, Challenges, and Future Directions. In Proceedings of the 29th International Conference on Evaluation and Assessment in Software</w:t>
       </w:r>
       <w:r>
@@ -16387,54 +16293,54 @@
           <w:sz w:val="20"/>
           <w:szCs w:val="20"/>
         </w:rPr>
-        <w:t>Zett</w:t>
-      </w:r>
+        <w:t>Zettlemoyer</w:t>
+      </w:r>
+      <w:proofErr w:type="spellEnd"/>
       <w:r>
         <w:rPr>
           <w:sz w:val="20"/>
           <w:szCs w:val="20"/>
         </w:rPr>
-        <w:t>lemoyer</w:t>
-      </w:r>
-      <w:proofErr w:type="spellEnd"/>
+        <w:t xml:space="preserve">, L. </w:t>
+      </w:r>
+      <w:proofErr w:type="spellStart"/>
       <w:r>
         <w:rPr>
           <w:sz w:val="20"/>
           <w:szCs w:val="20"/>
         </w:rPr>
-        <w:t xml:space="preserve">, L. </w:t>
-      </w:r>
-      <w:proofErr w:type="spellStart"/>
+        <w:t>QLoRA</w:t>
+      </w:r>
+      <w:proofErr w:type="spellEnd"/>
       <w:r>
         <w:rPr>
           <w:sz w:val="20"/>
           <w:szCs w:val="20"/>
         </w:rPr>
-        <w:t>QLoRA</w:t>
-      </w:r>
-      <w:proofErr w:type="spellEnd"/>
+        <w:t>: Efficient Finetuning of Quantized LLMs. In Advances in Neural Information Processing Systems 36 (</w:t>
+      </w:r>
+      <w:proofErr w:type="spellStart"/>
       <w:r>
         <w:rPr>
           <w:sz w:val="20"/>
           <w:szCs w:val="20"/>
         </w:rPr>
-        <w:t>: Efficient Finetuning of Quantized LLMs. In Advances in Neural Information Processing Systems 36 (</w:t>
-      </w:r>
-      <w:proofErr w:type="spellStart"/>
+        <w:t>NeurIPS</w:t>
+      </w:r>
+      <w:proofErr w:type="spellEnd"/>
       <w:r>
         <w:rPr>
           <w:sz w:val="20"/>
           <w:szCs w:val="20"/>
         </w:rPr>
-        <w:t>NeurIPS</w:t>
-      </w:r>
-      <w:proofErr w:type="spellEnd"/>
+        <w:t xml:space="preserve"> 2023), arXiv:2305.14314. Fine-tun</w:t>
+      </w:r>
       <w:r>
         <w:rPr>
           <w:sz w:val="20"/>
           <w:szCs w:val="20"/>
         </w:rPr>
-        <w:t xml:space="preserve"> 2023), arXiv:2305.14314. Fine-tuning method used. </w:t>
+        <w:t xml:space="preserve">ing method used. </w:t>
       </w:r>
       <w:hyperlink r:id="rId17" w:history="1">
         <w:r>
@@ -16472,7 +16378,16 @@
             <w:szCs w:val="20"/>
             <w:u w:val="single"/>
           </w:rPr>
-          <w:t>https://tree-sitter.github.io/tree-sitter/</w:t>
+          <w:t>https://tre</w:t>
+        </w:r>
+        <w:r>
+          <w:rPr>
+            <w:color w:val="0563C1"/>
+            <w:sz w:val="20"/>
+            <w:szCs w:val="20"/>
+            <w:u w:val="single"/>
+          </w:rPr>
+          <w:t>e-sitter.github.io/tree-sitter/</w:t>
         </w:r>
       </w:hyperlink>
     </w:p>
@@ -16489,10 +16404,10 @@
 <file path=word/numbering.xml><?xml version="1.0" encoding="utf-8"?>
 <w:numbering xmlns:wpc="http://schemas.microsoft.com/office/word/2010/wordprocessingCanvas" xmlns:cx="http://schemas.microsoft.com/office/drawing/2014/chartex" xmlns:cx1="http://schemas.microsoft.com/office/drawing/2015/9/8/chartex" xmlns:cx2="http://schemas.microsoft.com/office/drawing/2015/10/21/chartex" xmlns:cx3="http://schemas.microsoft.com/office/drawing/2016/5/9/chartex" xmlns:cx4="http://schemas.microsoft.com/office/drawing/2016/5/10/chartex" xmlns:cx5="http://schemas.microsoft.com/office/drawing/2016/5/11/chartex" xmlns:cx6="http://schemas.microsoft.com/office/drawing/2016/5/12/chartex" xmlns:cx7="http://schemas.microsoft.com/office/drawing/2016/5/13/chartex" xmlns:cx8="http://schemas.microsoft.com/office/drawing/2016/5/14/chartex" xmlns:mc="http://schemas.openxmlformats.org/markup-compatibility/2006" xmlns:aink="http://schemas.microsoft.com/office/drawing/2016/ink" xmlns:am3d="http://schemas.microsoft.com/office/drawing/2017/model3d" xmlns:o="urn:schemas-microsoft-com:office:office" xmlns:r="http://schemas.openxmlformats.org/officeDocument/2006/relationships" xmlns:m="http://schemas.openxmlformats.org/officeDocument/2006/math" xmlns:v="urn:schemas-microsoft-com:vml" xmlns:wp14="http://schemas.microsoft.com/office/word/2010/wordprocessingDrawing" xmlns:wp="http://schemas.openxmlformats.org/drawingml/2006/wordprocessingDrawing" xmlns:w10="urn:schemas-microsoft-com:office:word" xmlns:w="http://schemas.openxmlformats.org/wordprocessingml/2006/main" xmlns:w14="http://schemas.microsoft.com/office/word/2010/wordml" xmlns:w15="http://schemas.microsoft.com/office/word/2012/wordml" xmlns:w16cex="http://schemas.microsoft.com/office/word/2018/wordml/cex" xmlns:w16cid="http://schemas.microsoft.com/office/word/2016/wordml/cid" xmlns:w16="http://schemas.microsoft.com/office/word/2018/wordml" xmlns:w16sdtdh="http://schemas.microsoft.com/office/word/2020/wordml/sdtdatahash" xmlns:w16se="http://schemas.microsoft.com/office/word/2015/wordml/symex" xmlns:wpg="http://schemas.microsoft.com/office/word/2010/wordprocessingGroup" xmlns:wpi="http://schemas.microsoft.com/office/word/2010/wordprocessingInk" xmlns:wne="http://schemas.microsoft.com/office/word/2006/wordml" xmlns:wps="http://schemas.microsoft.com/office/word/2010/wordprocessingShape" mc:Ignorable="w14 w15 w16se w16cid w16 w16cex w16sdtdh wp14">
   <w:abstractNum w:abstractNumId="0" w15:restartNumberingAfterBreak="0">
-    <w:nsid w:val="40595EF2"/>
+    <w:nsid w:val="6D0B1FCF"/>
     <w:multiLevelType w:val="hybridMultilevel"/>
-    <w:tmpl w:val="8446E8D4"/>
-    <w:lvl w:ilvl="0" w:tplc="C42A2F6A">
+    <w:tmpl w:val="19345F0C"/>
+    <w:lvl w:ilvl="0" w:tplc="C55CF1CE">
       <w:start w:val="1"/>
       <w:numFmt w:val="bullet"/>
       <w:lvlText w:val="●"/>
@@ -16501,7 +16416,7 @@
         <w:ind w:left="720" w:hanging="360"/>
       </w:pPr>
     </w:lvl>
-    <w:lvl w:ilvl="1" w:tplc="3EE8A334">
+    <w:lvl w:ilvl="1" w:tplc="15AE13C6">
       <w:start w:val="1"/>
       <w:numFmt w:val="bullet"/>
       <w:lvlText w:val="○"/>
@@ -16510,7 +16425,7 @@
         <w:ind w:left="1440" w:hanging="360"/>
       </w:pPr>
     </w:lvl>
-    <w:lvl w:ilvl="2" w:tplc="713A32A2">
+    <w:lvl w:ilvl="2" w:tplc="0728EE48">
       <w:start w:val="1"/>
       <w:numFmt w:val="bullet"/>
       <w:lvlText w:val="■"/>
@@ -16519,7 +16434,7 @@
         <w:ind w:left="2160" w:hanging="360"/>
       </w:pPr>
     </w:lvl>
-    <w:lvl w:ilvl="3" w:tplc="C8C84B4E">
+    <w:lvl w:ilvl="3" w:tplc="DBCCC36C">
       <w:start w:val="1"/>
       <w:numFmt w:val="bullet"/>
       <w:lvlText w:val="●"/>
@@ -16528,7 +16443,7 @@
         <w:ind w:left="2880" w:hanging="360"/>
       </w:pPr>
     </w:lvl>
-    <w:lvl w:ilvl="4" w:tplc="7678674A">
+    <w:lvl w:ilvl="4" w:tplc="8C5AB924">
       <w:start w:val="1"/>
       <w:numFmt w:val="bullet"/>
       <w:lvlText w:val="○"/>
@@ -16537,7 +16452,7 @@
         <w:ind w:left="3600" w:hanging="360"/>
       </w:pPr>
     </w:lvl>
-    <w:lvl w:ilvl="5" w:tplc="043CD12C">
+    <w:lvl w:ilvl="5" w:tplc="1E24AE64">
       <w:start w:val="1"/>
       <w:numFmt w:val="bullet"/>
       <w:lvlText w:val="■"/>
@@ -16546,7 +16461,7 @@
         <w:ind w:left="4320" w:hanging="360"/>
       </w:pPr>
     </w:lvl>
-    <w:lvl w:ilvl="6" w:tplc="0F186B3A">
+    <w:lvl w:ilvl="6" w:tplc="E61ECF0A">
       <w:start w:val="1"/>
       <w:numFmt w:val="bullet"/>
       <w:lvlText w:val="●"/>
@@ -16555,7 +16470,7 @@
         <w:ind w:left="5040" w:hanging="360"/>
       </w:pPr>
     </w:lvl>
-    <w:lvl w:ilvl="7" w:tplc="1450AD3C">
+    <w:lvl w:ilvl="7" w:tplc="40F41CD4">
       <w:start w:val="1"/>
       <w:numFmt w:val="bullet"/>
       <w:lvlText w:val="●"/>
@@ -16564,7 +16479,7 @@
         <w:ind w:left="5760" w:hanging="360"/>
       </w:pPr>
     </w:lvl>
-    <w:lvl w:ilvl="8" w:tplc="45C4FA4C">
+    <w:lvl w:ilvl="8" w:tplc="34B0A3C0">
       <w:start w:val="1"/>
       <w:numFmt w:val="bullet"/>
       <w:lvlText w:val="●"/>

</xml_diff>

<commit_message>
updated section 6 in paper
</commit_message>
<xml_diff>
--- a/SecureAssist_Paper.docx
+++ b/SecureAssist_Paper.docx
@@ -14423,15 +14423,15 @@
         <w:spacing w:after="130" w:line="278" w:lineRule="auto"/>
       </w:pPr>
       <w:r>
-        <w:t xml:space="preserve">The two configurations are compared below on every benchmark. Python figures are per labelled finding; Java and C figures are per test case. The units differ, so </w:t>
-      </w:r>
-      <w:r>
-        <w:t>the rows are not pooled into a single number.</w:t>
+        <w:t xml:space="preserve">The two configurations are compared below on every benchmark, on recall, precision, F1 and F3, so that the recall-weighted and precision-weighted readings can be </w:t>
+      </w:r>
+      <w:r>
+        <w:t>seen side by side. Python figures are per labelled finding; Java and C figures are per test case. The units differ, so Python is not pooled with the other two.</w:t>
       </w:r>
     </w:p>
     <w:tbl>
       <w:tblPr>
-        <w:tblW w:w="9026" w:type="dxa"/>
+        <w:tblW w:w="9000" w:type="dxa"/>
         <w:tblBorders>
           <w:top w:val="single" w:sz="2" w:space="0" w:color="AAAAAA"/>
           <w:left w:val="single" w:sz="2" w:space="0" w:color="AAAAAA"/>
@@ -14447,12 +14447,12 @@
         <w:tblLook w:val="0000" w:firstRow="0" w:lastRow="0" w:firstColumn="0" w:lastColumn="0" w:noHBand="0" w:noVBand="0"/>
       </w:tblPr>
       <w:tblGrid>
-        <w:gridCol w:w="1750"/>
-        <w:gridCol w:w="1350"/>
-        <w:gridCol w:w="1350"/>
-        <w:gridCol w:w="1350"/>
-        <w:gridCol w:w="1350"/>
-        <w:gridCol w:w="1876"/>
+        <w:gridCol w:w="2300"/>
+        <w:gridCol w:w="1250"/>
+        <w:gridCol w:w="1400"/>
+        <w:gridCol w:w="1450"/>
+        <w:gridCol w:w="1300"/>
+        <w:gridCol w:w="1300"/>
       </w:tblGrid>
       <w:tr>
         <w:tblPrEx>
@@ -14466,7 +14466,7 @@
         </w:trPr>
         <w:tc>
           <w:tcPr>
-            <w:tcW w:w="1750" w:type="dxa"/>
+            <w:tcW w:w="2300" w:type="dxa"/>
             <w:shd w:val="clear" w:color="auto" w:fill="1F4E79"/>
             <w:tcMar>
               <w:top w:w="55" w:type="dxa"/>
@@ -14493,7 +14493,7 @@
         </w:tc>
         <w:tc>
           <w:tcPr>
-            <w:tcW w:w="1350" w:type="dxa"/>
+            <w:tcW w:w="1250" w:type="dxa"/>
             <w:shd w:val="clear" w:color="auto" w:fill="1F4E79"/>
             <w:tcMar>
               <w:top w:w="55" w:type="dxa"/>
@@ -14515,13 +14515,13 @@
                 <w:sz w:val="18"/>
                 <w:szCs w:val="18"/>
               </w:rPr>
-              <w:t>Static recall</w:t>
-            </w:r>
-          </w:p>
-        </w:tc>
-        <w:tc>
-          <w:tcPr>
-            <w:tcW w:w="1350" w:type="dxa"/>
+              <w:t>Config</w:t>
+            </w:r>
+          </w:p>
+        </w:tc>
+        <w:tc>
+          <w:tcPr>
+            <w:tcW w:w="1400" w:type="dxa"/>
             <w:shd w:val="clear" w:color="auto" w:fill="1F4E79"/>
             <w:tcMar>
               <w:top w:w="55" w:type="dxa"/>
@@ -14543,13 +14543,13 @@
                 <w:sz w:val="18"/>
                 <w:szCs w:val="18"/>
               </w:rPr>
-              <w:t>Hybrid recall</w:t>
-            </w:r>
-          </w:p>
-        </w:tc>
-        <w:tc>
-          <w:tcPr>
-            <w:tcW w:w="1350" w:type="dxa"/>
+              <w:t>Recall</w:t>
+            </w:r>
+          </w:p>
+        </w:tc>
+        <w:tc>
+          <w:tcPr>
+            <w:tcW w:w="1450" w:type="dxa"/>
             <w:shd w:val="clear" w:color="auto" w:fill="1F4E79"/>
             <w:tcMar>
               <w:top w:w="55" w:type="dxa"/>
@@ -14571,13 +14571,13 @@
                 <w:sz w:val="18"/>
                 <w:szCs w:val="18"/>
               </w:rPr>
-              <w:t>Static F3</w:t>
-            </w:r>
-          </w:p>
-        </w:tc>
-        <w:tc>
-          <w:tcPr>
-            <w:tcW w:w="1350" w:type="dxa"/>
+              <w:t>Precision</w:t>
+            </w:r>
+          </w:p>
+        </w:tc>
+        <w:tc>
+          <w:tcPr>
+            <w:tcW w:w="1300" w:type="dxa"/>
             <w:shd w:val="clear" w:color="auto" w:fill="1F4E79"/>
             <w:tcMar>
               <w:top w:w="55" w:type="dxa"/>
@@ -14599,13 +14599,13 @@
                 <w:sz w:val="18"/>
                 <w:szCs w:val="18"/>
               </w:rPr>
-              <w:t>Hybrid F3</w:t>
-            </w:r>
-          </w:p>
-        </w:tc>
-        <w:tc>
-          <w:tcPr>
-            <w:tcW w:w="1876" w:type="dxa"/>
+              <w:t>F1</w:t>
+            </w:r>
+          </w:p>
+        </w:tc>
+        <w:tc>
+          <w:tcPr>
+            <w:tcW w:w="1300" w:type="dxa"/>
             <w:shd w:val="clear" w:color="auto" w:fill="1F4E79"/>
             <w:tcMar>
               <w:top w:w="55" w:type="dxa"/>
@@ -14627,7 +14627,7 @@
                 <w:sz w:val="18"/>
                 <w:szCs w:val="18"/>
               </w:rPr>
-              <w:t>Change</w:t>
+              <w:t>F3</w:t>
             </w:r>
           </w:p>
         </w:tc>
@@ -14641,7 +14641,7 @@
         </w:tblPrEx>
         <w:tc>
           <w:tcPr>
-            <w:tcW w:w="1750" w:type="dxa"/>
+            <w:tcW w:w="2300" w:type="dxa"/>
             <w:tcMar>
               <w:top w:w="55" w:type="dxa"/>
               <w:left w:w="85" w:type="dxa"/>
@@ -14665,7 +14665,32 @@
         </w:tc>
         <w:tc>
           <w:tcPr>
-            <w:tcW w:w="1350" w:type="dxa"/>
+            <w:tcW w:w="1250" w:type="dxa"/>
+            <w:tcMar>
+              <w:top w:w="55" w:type="dxa"/>
+              <w:left w:w="85" w:type="dxa"/>
+              <w:bottom w:w="55" w:type="dxa"/>
+              <w:right w:w="85" w:type="dxa"/>
+            </w:tcMar>
+          </w:tcPr>
+          <w:p>
+            <w:pPr>
+              <w:bidi w:val="0"/>
+              <w:jc w:val="center"/>
+            </w:pPr>
+            <w:r>
+              <w:rPr>
+                <w:color w:val="000000"/>
+                <w:sz w:val="18"/>
+                <w:szCs w:val="18"/>
+              </w:rPr>
+              <w:t>Static</w:t>
+            </w:r>
+          </w:p>
+        </w:tc>
+        <w:tc>
+          <w:tcPr>
+            <w:tcW w:w="1400" w:type="dxa"/>
             <w:tcMar>
               <w:top w:w="55" w:type="dxa"/>
               <w:left w:w="85" w:type="dxa"/>
@@ -14690,32 +14715,57 @@
         </w:tc>
         <w:tc>
           <w:tcPr>
-            <w:tcW w:w="1350" w:type="dxa"/>
-            <w:tcMar>
-              <w:top w:w="55" w:type="dxa"/>
-              <w:left w:w="85" w:type="dxa"/>
-              <w:bottom w:w="55" w:type="dxa"/>
-              <w:right w:w="85" w:type="dxa"/>
-            </w:tcMar>
-          </w:tcPr>
-          <w:p>
-            <w:pPr>
-              <w:bidi w:val="0"/>
-              <w:jc w:val="center"/>
-            </w:pPr>
-            <w:r>
-              <w:rPr>
-                <w:color w:val="000000"/>
-                <w:sz w:val="18"/>
-                <w:szCs w:val="18"/>
-              </w:rPr>
-              <w:t>75.8%</w:t>
-            </w:r>
-          </w:p>
-        </w:tc>
-        <w:tc>
-          <w:tcPr>
-            <w:tcW w:w="1350" w:type="dxa"/>
+            <w:tcW w:w="1450" w:type="dxa"/>
+            <w:tcMar>
+              <w:top w:w="55" w:type="dxa"/>
+              <w:left w:w="85" w:type="dxa"/>
+              <w:bottom w:w="55" w:type="dxa"/>
+              <w:right w:w="85" w:type="dxa"/>
+            </w:tcMar>
+          </w:tcPr>
+          <w:p>
+            <w:pPr>
+              <w:bidi w:val="0"/>
+              <w:jc w:val="center"/>
+            </w:pPr>
+            <w:r>
+              <w:rPr>
+                <w:color w:val="000000"/>
+                <w:sz w:val="18"/>
+                <w:szCs w:val="18"/>
+              </w:rPr>
+              <w:t>67.7%</w:t>
+            </w:r>
+          </w:p>
+        </w:tc>
+        <w:tc>
+          <w:tcPr>
+            <w:tcW w:w="1300" w:type="dxa"/>
+            <w:tcMar>
+              <w:top w:w="55" w:type="dxa"/>
+              <w:left w:w="85" w:type="dxa"/>
+              <w:bottom w:w="55" w:type="dxa"/>
+              <w:right w:w="85" w:type="dxa"/>
+            </w:tcMar>
+          </w:tcPr>
+          <w:p>
+            <w:pPr>
+              <w:bidi w:val="0"/>
+              <w:jc w:val="center"/>
+            </w:pPr>
+            <w:r>
+              <w:rPr>
+                <w:color w:val="000000"/>
+                <w:sz w:val="18"/>
+                <w:szCs w:val="18"/>
+              </w:rPr>
+              <w:t>67.5</w:t>
+            </w:r>
+          </w:p>
+        </w:tc>
+        <w:tc>
+          <w:tcPr>
+            <w:tcW w:w="1300" w:type="dxa"/>
             <w:tcMar>
               <w:top w:w="55" w:type="dxa"/>
               <w:left w:w="85" w:type="dxa"/>
@@ -14735,56 +14785,6 @@
                 <w:szCs w:val="18"/>
               </w:rPr>
               <w:t>67.2</w:t>
-            </w:r>
-          </w:p>
-        </w:tc>
-        <w:tc>
-          <w:tcPr>
-            <w:tcW w:w="1350" w:type="dxa"/>
-            <w:tcMar>
-              <w:top w:w="55" w:type="dxa"/>
-              <w:left w:w="85" w:type="dxa"/>
-              <w:bottom w:w="55" w:type="dxa"/>
-              <w:right w:w="85" w:type="dxa"/>
-            </w:tcMar>
-          </w:tcPr>
-          <w:p>
-            <w:pPr>
-              <w:bidi w:val="0"/>
-              <w:jc w:val="center"/>
-            </w:pPr>
-            <w:r>
-              <w:rPr>
-                <w:color w:val="000000"/>
-                <w:sz w:val="18"/>
-                <w:szCs w:val="18"/>
-              </w:rPr>
-              <w:t>72.0</w:t>
-            </w:r>
-          </w:p>
-        </w:tc>
-        <w:tc>
-          <w:tcPr>
-            <w:tcW w:w="1876" w:type="dxa"/>
-            <w:tcMar>
-              <w:top w:w="55" w:type="dxa"/>
-              <w:left w:w="85" w:type="dxa"/>
-              <w:bottom w:w="55" w:type="dxa"/>
-              <w:right w:w="85" w:type="dxa"/>
-            </w:tcMar>
-          </w:tcPr>
-          <w:p>
-            <w:pPr>
-              <w:bidi w:val="0"/>
-              <w:jc w:val="center"/>
-            </w:pPr>
-            <w:r>
-              <w:rPr>
-                <w:color w:val="000000"/>
-                <w:sz w:val="18"/>
-                <w:szCs w:val="18"/>
-              </w:rPr>
-              <w:t>+4.8</w:t>
             </w:r>
           </w:p>
         </w:tc>
@@ -14798,7 +14798,7 @@
         </w:tblPrEx>
         <w:tc>
           <w:tcPr>
-            <w:tcW w:w="1750" w:type="dxa"/>
+            <w:tcW w:w="2300" w:type="dxa"/>
             <w:shd w:val="clear" w:color="auto" w:fill="F2F6FA"/>
             <w:tcMar>
               <w:top w:w="55" w:type="dxa"/>
@@ -14811,19 +14811,11 @@
             <w:pPr>
               <w:bidi w:val="0"/>
             </w:pPr>
-            <w:r>
-              <w:rPr>
-                <w:color w:val="000000"/>
-                <w:sz w:val="18"/>
-                <w:szCs w:val="18"/>
-              </w:rPr>
-              <w:t>Java - OWASP</w:t>
-            </w:r>
-          </w:p>
-        </w:tc>
-        <w:tc>
-          <w:tcPr>
-            <w:tcW w:w="1350" w:type="dxa"/>
+          </w:p>
+        </w:tc>
+        <w:tc>
+          <w:tcPr>
+            <w:tcW w:w="1250" w:type="dxa"/>
             <w:shd w:val="clear" w:color="auto" w:fill="F2F6FA"/>
             <w:tcMar>
               <w:top w:w="55" w:type="dxa"/>
@@ -14843,13 +14835,13 @@
                 <w:sz w:val="18"/>
                 <w:szCs w:val="18"/>
               </w:rPr>
-              <w:t>77.5%</w:t>
-            </w:r>
-          </w:p>
-        </w:tc>
-        <w:tc>
-          <w:tcPr>
-            <w:tcW w:w="1350" w:type="dxa"/>
+              <w:t>Hybrid</w:t>
+            </w:r>
+          </w:p>
+        </w:tc>
+        <w:tc>
+          <w:tcPr>
+            <w:tcW w:w="1400" w:type="dxa"/>
             <w:shd w:val="clear" w:color="auto" w:fill="F2F6FA"/>
             <w:tcMar>
               <w:top w:w="55" w:type="dxa"/>
@@ -14869,13 +14861,13 @@
                 <w:sz w:val="18"/>
                 <w:szCs w:val="18"/>
               </w:rPr>
-              <w:t>90.3%</w:t>
-            </w:r>
-          </w:p>
-        </w:tc>
-        <w:tc>
-          <w:tcPr>
-            <w:tcW w:w="1350" w:type="dxa"/>
+              <w:t>75.8%</w:t>
+            </w:r>
+          </w:p>
+        </w:tc>
+        <w:tc>
+          <w:tcPr>
+            <w:tcW w:w="1450" w:type="dxa"/>
             <w:shd w:val="clear" w:color="auto" w:fill="F2F6FA"/>
             <w:tcMar>
               <w:top w:w="55" w:type="dxa"/>
@@ -14895,13 +14887,13 @@
                 <w:sz w:val="18"/>
                 <w:szCs w:val="18"/>
               </w:rPr>
-              <w:t>77.1</w:t>
-            </w:r>
-          </w:p>
-        </w:tc>
-        <w:tc>
-          <w:tcPr>
-            <w:tcW w:w="1350" w:type="dxa"/>
+              <w:t>49.5%</w:t>
+            </w:r>
+          </w:p>
+        </w:tc>
+        <w:tc>
+          <w:tcPr>
+            <w:tcW w:w="1300" w:type="dxa"/>
             <w:shd w:val="clear" w:color="auto" w:fill="F2F6FA"/>
             <w:tcMar>
               <w:top w:w="55" w:type="dxa"/>
@@ -14921,13 +14913,13 @@
                 <w:sz w:val="18"/>
                 <w:szCs w:val="18"/>
               </w:rPr>
-              <w:t>87.6</w:t>
-            </w:r>
-          </w:p>
-        </w:tc>
-        <w:tc>
-          <w:tcPr>
-            <w:tcW w:w="1876" w:type="dxa"/>
+              <w:t>59.9</w:t>
+            </w:r>
+          </w:p>
+        </w:tc>
+        <w:tc>
+          <w:tcPr>
+            <w:tcW w:w="1300" w:type="dxa"/>
             <w:shd w:val="clear" w:color="auto" w:fill="F2F6FA"/>
             <w:tcMar>
               <w:top w:w="55" w:type="dxa"/>
@@ -14947,7 +14939,7 @@
                 <w:sz w:val="18"/>
                 <w:szCs w:val="18"/>
               </w:rPr>
-              <w:t>+10.5</w:t>
+              <w:t>72.0</w:t>
             </w:r>
           </w:p>
         </w:tc>
@@ -14961,150 +14953,150 @@
         </w:tblPrEx>
         <w:tc>
           <w:tcPr>
-            <w:tcW w:w="1750" w:type="dxa"/>
-            <w:tcMar>
-              <w:top w:w="55" w:type="dxa"/>
-              <w:left w:w="85" w:type="dxa"/>
-              <w:bottom w:w="55" w:type="dxa"/>
-              <w:right w:w="85" w:type="dxa"/>
-            </w:tcMar>
-          </w:tcPr>
-          <w:p>
-            <w:pPr>
-              <w:bidi w:val="0"/>
-            </w:pPr>
-            <w:r>
-              <w:rPr>
-                <w:color w:val="000000"/>
-                <w:sz w:val="18"/>
-                <w:szCs w:val="18"/>
-              </w:rPr>
-              <w:t>C - Juliet</w:t>
-            </w:r>
-          </w:p>
-        </w:tc>
-        <w:tc>
-          <w:tcPr>
-            <w:tcW w:w="1350" w:type="dxa"/>
-            <w:tcMar>
-              <w:top w:w="55" w:type="dxa"/>
-              <w:left w:w="85" w:type="dxa"/>
-              <w:bottom w:w="55" w:type="dxa"/>
-              <w:right w:w="85" w:type="dxa"/>
-            </w:tcMar>
-          </w:tcPr>
-          <w:p>
-            <w:pPr>
-              <w:bidi w:val="0"/>
-              <w:jc w:val="center"/>
-            </w:pPr>
-            <w:r>
-              <w:rPr>
-                <w:color w:val="000000"/>
-                <w:sz w:val="18"/>
-                <w:szCs w:val="18"/>
-              </w:rPr>
-              <w:t>52.1%</w:t>
-            </w:r>
-          </w:p>
-        </w:tc>
-        <w:tc>
-          <w:tcPr>
-            <w:tcW w:w="1350" w:type="dxa"/>
-            <w:tcMar>
-              <w:top w:w="55" w:type="dxa"/>
-              <w:left w:w="85" w:type="dxa"/>
-              <w:bottom w:w="55" w:type="dxa"/>
-              <w:right w:w="85" w:type="dxa"/>
-            </w:tcMar>
-          </w:tcPr>
-          <w:p>
-            <w:pPr>
-              <w:bidi w:val="0"/>
-              <w:jc w:val="center"/>
-            </w:pPr>
-            <w:r>
-              <w:rPr>
-                <w:color w:val="000000"/>
-                <w:sz w:val="18"/>
-                <w:szCs w:val="18"/>
-              </w:rPr>
-              <w:t>62.8%</w:t>
-            </w:r>
-          </w:p>
-        </w:tc>
-        <w:tc>
-          <w:tcPr>
-            <w:tcW w:w="1350" w:type="dxa"/>
-            <w:tcMar>
-              <w:top w:w="55" w:type="dxa"/>
-              <w:left w:w="85" w:type="dxa"/>
-              <w:bottom w:w="55" w:type="dxa"/>
-              <w:right w:w="85" w:type="dxa"/>
-            </w:tcMar>
-          </w:tcPr>
-          <w:p>
-            <w:pPr>
-              <w:bidi w:val="0"/>
-              <w:jc w:val="center"/>
-            </w:pPr>
-            <w:r>
-              <w:rPr>
-                <w:color w:val="000000"/>
-                <w:sz w:val="18"/>
-                <w:szCs w:val="18"/>
-              </w:rPr>
-              <w:t>52.5</w:t>
-            </w:r>
-          </w:p>
-        </w:tc>
-        <w:tc>
-          <w:tcPr>
-            <w:tcW w:w="1350" w:type="dxa"/>
-            <w:tcMar>
-              <w:top w:w="55" w:type="dxa"/>
-              <w:left w:w="85" w:type="dxa"/>
-              <w:bottom w:w="55" w:type="dxa"/>
-              <w:right w:w="85" w:type="dxa"/>
-            </w:tcMar>
-          </w:tcPr>
-          <w:p>
-            <w:pPr>
-              <w:bidi w:val="0"/>
-              <w:jc w:val="center"/>
-            </w:pPr>
-            <w:r>
-              <w:rPr>
-                <w:color w:val="000000"/>
-                <w:sz w:val="18"/>
-                <w:szCs w:val="18"/>
-              </w:rPr>
-              <w:t>62.5</w:t>
-            </w:r>
-          </w:p>
-        </w:tc>
-        <w:tc>
-          <w:tcPr>
-            <w:tcW w:w="1876" w:type="dxa"/>
-            <w:tcMar>
-              <w:top w:w="55" w:type="dxa"/>
-              <w:left w:w="85" w:type="dxa"/>
-              <w:bottom w:w="55" w:type="dxa"/>
-              <w:right w:w="85" w:type="dxa"/>
-            </w:tcMar>
-          </w:tcPr>
-          <w:p>
-            <w:pPr>
-              <w:bidi w:val="0"/>
-              <w:jc w:val="center"/>
-            </w:pPr>
-            <w:r>
-              <w:rPr>
-                <w:color w:val="000000"/>
-                <w:sz w:val="18"/>
-                <w:szCs w:val="18"/>
-              </w:rPr>
-              <w:t>+10.0</w:t>
+            <w:tcW w:w="2300" w:type="dxa"/>
+            <w:tcMar>
+              <w:top w:w="55" w:type="dxa"/>
+              <w:left w:w="85" w:type="dxa"/>
+              <w:bottom w:w="55" w:type="dxa"/>
+              <w:right w:w="85" w:type="dxa"/>
+            </w:tcMar>
+          </w:tcPr>
+          <w:p>
+            <w:pPr>
+              <w:bidi w:val="0"/>
+            </w:pPr>
+            <w:r>
+              <w:rPr>
+                <w:color w:val="000000"/>
+                <w:sz w:val="18"/>
+                <w:szCs w:val="18"/>
+              </w:rPr>
+              <w:t>Java - OWASP</w:t>
+            </w:r>
+          </w:p>
+        </w:tc>
+        <w:tc>
+          <w:tcPr>
+            <w:tcW w:w="1250" w:type="dxa"/>
+            <w:tcMar>
+              <w:top w:w="55" w:type="dxa"/>
+              <w:left w:w="85" w:type="dxa"/>
+              <w:bottom w:w="55" w:type="dxa"/>
+              <w:right w:w="85" w:type="dxa"/>
+            </w:tcMar>
+          </w:tcPr>
+          <w:p>
+            <w:pPr>
+              <w:bidi w:val="0"/>
+              <w:jc w:val="center"/>
+            </w:pPr>
+            <w:r>
+              <w:rPr>
+                <w:color w:val="000000"/>
+                <w:sz w:val="18"/>
+                <w:szCs w:val="18"/>
+              </w:rPr>
+              <w:t>Static</w:t>
+            </w:r>
+          </w:p>
+        </w:tc>
+        <w:tc>
+          <w:tcPr>
+            <w:tcW w:w="1400" w:type="dxa"/>
+            <w:tcMar>
+              <w:top w:w="55" w:type="dxa"/>
+              <w:left w:w="85" w:type="dxa"/>
+              <w:bottom w:w="55" w:type="dxa"/>
+              <w:right w:w="85" w:type="dxa"/>
+            </w:tcMar>
+          </w:tcPr>
+          <w:p>
+            <w:pPr>
+              <w:bidi w:val="0"/>
+              <w:jc w:val="center"/>
+            </w:pPr>
+            <w:r>
+              <w:rPr>
+                <w:color w:val="000000"/>
+                <w:sz w:val="18"/>
+                <w:szCs w:val="18"/>
+              </w:rPr>
+              <w:t>77.5%</w:t>
+            </w:r>
+          </w:p>
+        </w:tc>
+        <w:tc>
+          <w:tcPr>
+            <w:tcW w:w="1450" w:type="dxa"/>
+            <w:tcMar>
+              <w:top w:w="55" w:type="dxa"/>
+              <w:left w:w="85" w:type="dxa"/>
+              <w:bottom w:w="55" w:type="dxa"/>
+              <w:right w:w="85" w:type="dxa"/>
+            </w:tcMar>
+          </w:tcPr>
+          <w:p>
+            <w:pPr>
+              <w:bidi w:val="0"/>
+              <w:jc w:val="center"/>
+            </w:pPr>
+            <w:r>
+              <w:rPr>
+                <w:color w:val="000000"/>
+                <w:sz w:val="18"/>
+                <w:szCs w:val="18"/>
+              </w:rPr>
+              <w:t>74.0%</w:t>
+            </w:r>
+          </w:p>
+        </w:tc>
+        <w:tc>
+          <w:tcPr>
+            <w:tcW w:w="1300" w:type="dxa"/>
+            <w:tcMar>
+              <w:top w:w="55" w:type="dxa"/>
+              <w:left w:w="85" w:type="dxa"/>
+              <w:bottom w:w="55" w:type="dxa"/>
+              <w:right w:w="85" w:type="dxa"/>
+            </w:tcMar>
+          </w:tcPr>
+          <w:p>
+            <w:pPr>
+              <w:bidi w:val="0"/>
+              <w:jc w:val="center"/>
+            </w:pPr>
+            <w:r>
+              <w:rPr>
+                <w:color w:val="000000"/>
+                <w:sz w:val="18"/>
+                <w:szCs w:val="18"/>
+              </w:rPr>
+              <w:t>75.7</w:t>
+            </w:r>
+          </w:p>
+        </w:tc>
+        <w:tc>
+          <w:tcPr>
+            <w:tcW w:w="1300" w:type="dxa"/>
+            <w:tcMar>
+              <w:top w:w="55" w:type="dxa"/>
+              <w:left w:w="85" w:type="dxa"/>
+              <w:bottom w:w="55" w:type="dxa"/>
+              <w:right w:w="85" w:type="dxa"/>
+            </w:tcMar>
+          </w:tcPr>
+          <w:p>
+            <w:pPr>
+              <w:bidi w:val="0"/>
+              <w:jc w:val="center"/>
+            </w:pPr>
+            <w:r>
+              <w:rPr>
+                <w:color w:val="000000"/>
+                <w:sz w:val="18"/>
+                <w:szCs w:val="18"/>
+              </w:rPr>
+              <w:t>77.1</w:t>
             </w:r>
           </w:p>
         </w:tc>
@@ -15118,7 +15110,474 @@
         </w:tblPrEx>
         <w:tc>
           <w:tcPr>
-            <w:tcW w:w="1750" w:type="dxa"/>
+            <w:tcW w:w="2300" w:type="dxa"/>
+            <w:shd w:val="clear" w:color="auto" w:fill="F2F6FA"/>
+            <w:tcMar>
+              <w:top w:w="55" w:type="dxa"/>
+              <w:left w:w="85" w:type="dxa"/>
+              <w:bottom w:w="55" w:type="dxa"/>
+              <w:right w:w="85" w:type="dxa"/>
+            </w:tcMar>
+          </w:tcPr>
+          <w:p>
+            <w:pPr>
+              <w:bidi w:val="0"/>
+            </w:pPr>
+          </w:p>
+        </w:tc>
+        <w:tc>
+          <w:tcPr>
+            <w:tcW w:w="1250" w:type="dxa"/>
+            <w:shd w:val="clear" w:color="auto" w:fill="F2F6FA"/>
+            <w:tcMar>
+              <w:top w:w="55" w:type="dxa"/>
+              <w:left w:w="85" w:type="dxa"/>
+              <w:bottom w:w="55" w:type="dxa"/>
+              <w:right w:w="85" w:type="dxa"/>
+            </w:tcMar>
+          </w:tcPr>
+          <w:p>
+            <w:pPr>
+              <w:bidi w:val="0"/>
+              <w:jc w:val="center"/>
+            </w:pPr>
+            <w:r>
+              <w:rPr>
+                <w:color w:val="000000"/>
+                <w:sz w:val="18"/>
+                <w:szCs w:val="18"/>
+              </w:rPr>
+              <w:t>Hybrid</w:t>
+            </w:r>
+          </w:p>
+        </w:tc>
+        <w:tc>
+          <w:tcPr>
+            <w:tcW w:w="1400" w:type="dxa"/>
+            <w:shd w:val="clear" w:color="auto" w:fill="F2F6FA"/>
+            <w:tcMar>
+              <w:top w:w="55" w:type="dxa"/>
+              <w:left w:w="85" w:type="dxa"/>
+              <w:bottom w:w="55" w:type="dxa"/>
+              <w:right w:w="85" w:type="dxa"/>
+            </w:tcMar>
+          </w:tcPr>
+          <w:p>
+            <w:pPr>
+              <w:bidi w:val="0"/>
+              <w:jc w:val="center"/>
+            </w:pPr>
+            <w:r>
+              <w:rPr>
+                <w:color w:val="000000"/>
+                <w:sz w:val="18"/>
+                <w:szCs w:val="18"/>
+              </w:rPr>
+              <w:t>90.3%</w:t>
+            </w:r>
+          </w:p>
+        </w:tc>
+        <w:tc>
+          <w:tcPr>
+            <w:tcW w:w="1450" w:type="dxa"/>
+            <w:shd w:val="clear" w:color="auto" w:fill="F2F6FA"/>
+            <w:tcMar>
+              <w:top w:w="55" w:type="dxa"/>
+              <w:left w:w="85" w:type="dxa"/>
+              <w:bottom w:w="55" w:type="dxa"/>
+              <w:right w:w="85" w:type="dxa"/>
+            </w:tcMar>
+          </w:tcPr>
+          <w:p>
+            <w:pPr>
+              <w:bidi w:val="0"/>
+              <w:jc w:val="center"/>
+            </w:pPr>
+            <w:r>
+              <w:rPr>
+                <w:color w:val="000000"/>
+                <w:sz w:val="18"/>
+                <w:szCs w:val="18"/>
+              </w:rPr>
+              <w:t>68.6%</w:t>
+            </w:r>
+          </w:p>
+        </w:tc>
+        <w:tc>
+          <w:tcPr>
+            <w:tcW w:w="1300" w:type="dxa"/>
+            <w:shd w:val="clear" w:color="auto" w:fill="F2F6FA"/>
+            <w:tcMar>
+              <w:top w:w="55" w:type="dxa"/>
+              <w:left w:w="85" w:type="dxa"/>
+              <w:bottom w:w="55" w:type="dxa"/>
+              <w:right w:w="85" w:type="dxa"/>
+            </w:tcMar>
+          </w:tcPr>
+          <w:p>
+            <w:pPr>
+              <w:bidi w:val="0"/>
+              <w:jc w:val="center"/>
+            </w:pPr>
+            <w:r>
+              <w:rPr>
+                <w:color w:val="000000"/>
+                <w:sz w:val="18"/>
+                <w:szCs w:val="18"/>
+              </w:rPr>
+              <w:t>78.0</w:t>
+            </w:r>
+          </w:p>
+        </w:tc>
+        <w:tc>
+          <w:tcPr>
+            <w:tcW w:w="1300" w:type="dxa"/>
+            <w:shd w:val="clear" w:color="auto" w:fill="F2F6FA"/>
+            <w:tcMar>
+              <w:top w:w="55" w:type="dxa"/>
+              <w:left w:w="85" w:type="dxa"/>
+              <w:bottom w:w="55" w:type="dxa"/>
+              <w:right w:w="85" w:type="dxa"/>
+            </w:tcMar>
+          </w:tcPr>
+          <w:p>
+            <w:pPr>
+              <w:bidi w:val="0"/>
+              <w:jc w:val="center"/>
+            </w:pPr>
+            <w:r>
+              <w:rPr>
+                <w:color w:val="000000"/>
+                <w:sz w:val="18"/>
+                <w:szCs w:val="18"/>
+              </w:rPr>
+              <w:t>87.6</w:t>
+            </w:r>
+          </w:p>
+        </w:tc>
+      </w:tr>
+      <w:tr>
+        <w:tblPrEx>
+          <w:tblCellMar>
+            <w:top w:w="0" w:type="dxa"/>
+            <w:bottom w:w="0" w:type="dxa"/>
+          </w:tblCellMar>
+        </w:tblPrEx>
+        <w:tc>
+          <w:tcPr>
+            <w:tcW w:w="2300" w:type="dxa"/>
+            <w:tcMar>
+              <w:top w:w="55" w:type="dxa"/>
+              <w:left w:w="85" w:type="dxa"/>
+              <w:bottom w:w="55" w:type="dxa"/>
+              <w:right w:w="85" w:type="dxa"/>
+            </w:tcMar>
+          </w:tcPr>
+          <w:p>
+            <w:pPr>
+              <w:bidi w:val="0"/>
+            </w:pPr>
+            <w:r>
+              <w:rPr>
+                <w:color w:val="000000"/>
+                <w:sz w:val="18"/>
+                <w:szCs w:val="18"/>
+              </w:rPr>
+              <w:t>C - Juliet</w:t>
+            </w:r>
+          </w:p>
+        </w:tc>
+        <w:tc>
+          <w:tcPr>
+            <w:tcW w:w="1250" w:type="dxa"/>
+            <w:tcMar>
+              <w:top w:w="55" w:type="dxa"/>
+              <w:left w:w="85" w:type="dxa"/>
+              <w:bottom w:w="55" w:type="dxa"/>
+              <w:right w:w="85" w:type="dxa"/>
+            </w:tcMar>
+          </w:tcPr>
+          <w:p>
+            <w:pPr>
+              <w:bidi w:val="0"/>
+              <w:jc w:val="center"/>
+            </w:pPr>
+            <w:r>
+              <w:rPr>
+                <w:color w:val="000000"/>
+                <w:sz w:val="18"/>
+                <w:szCs w:val="18"/>
+              </w:rPr>
+              <w:t>Static</w:t>
+            </w:r>
+          </w:p>
+        </w:tc>
+        <w:tc>
+          <w:tcPr>
+            <w:tcW w:w="1400" w:type="dxa"/>
+            <w:tcMar>
+              <w:top w:w="55" w:type="dxa"/>
+              <w:left w:w="85" w:type="dxa"/>
+              <w:bottom w:w="55" w:type="dxa"/>
+              <w:right w:w="85" w:type="dxa"/>
+            </w:tcMar>
+          </w:tcPr>
+          <w:p>
+            <w:pPr>
+              <w:bidi w:val="0"/>
+              <w:jc w:val="center"/>
+            </w:pPr>
+            <w:r>
+              <w:rPr>
+                <w:color w:val="000000"/>
+                <w:sz w:val="18"/>
+                <w:szCs w:val="18"/>
+              </w:rPr>
+              <w:t>52.1%</w:t>
+            </w:r>
+          </w:p>
+        </w:tc>
+        <w:tc>
+          <w:tcPr>
+            <w:tcW w:w="1450" w:type="dxa"/>
+            <w:tcMar>
+              <w:top w:w="55" w:type="dxa"/>
+              <w:left w:w="85" w:type="dxa"/>
+              <w:bottom w:w="55" w:type="dxa"/>
+              <w:right w:w="85" w:type="dxa"/>
+            </w:tcMar>
+          </w:tcPr>
+          <w:p>
+            <w:pPr>
+              <w:bidi w:val="0"/>
+              <w:jc w:val="center"/>
+            </w:pPr>
+            <w:r>
+              <w:rPr>
+                <w:color w:val="000000"/>
+                <w:sz w:val="18"/>
+                <w:szCs w:val="18"/>
+              </w:rPr>
+              <w:t>55.8%</w:t>
+            </w:r>
+          </w:p>
+        </w:tc>
+        <w:tc>
+          <w:tcPr>
+            <w:tcW w:w="1300" w:type="dxa"/>
+            <w:tcMar>
+              <w:top w:w="55" w:type="dxa"/>
+              <w:left w:w="85" w:type="dxa"/>
+              <w:bottom w:w="55" w:type="dxa"/>
+              <w:right w:w="85" w:type="dxa"/>
+            </w:tcMar>
+          </w:tcPr>
+          <w:p>
+            <w:pPr>
+              <w:bidi w:val="0"/>
+              <w:jc w:val="center"/>
+            </w:pPr>
+            <w:r>
+              <w:rPr>
+                <w:color w:val="000000"/>
+                <w:sz w:val="18"/>
+                <w:szCs w:val="18"/>
+              </w:rPr>
+              <w:t>53.9</w:t>
+            </w:r>
+          </w:p>
+        </w:tc>
+        <w:tc>
+          <w:tcPr>
+            <w:tcW w:w="1300" w:type="dxa"/>
+            <w:tcMar>
+              <w:top w:w="55" w:type="dxa"/>
+              <w:left w:w="85" w:type="dxa"/>
+              <w:bottom w:w="55" w:type="dxa"/>
+              <w:right w:w="85" w:type="dxa"/>
+            </w:tcMar>
+          </w:tcPr>
+          <w:p>
+            <w:pPr>
+              <w:bidi w:val="0"/>
+              <w:jc w:val="center"/>
+            </w:pPr>
+            <w:r>
+              <w:rPr>
+                <w:color w:val="000000"/>
+                <w:sz w:val="18"/>
+                <w:szCs w:val="18"/>
+              </w:rPr>
+              <w:t>52.5</w:t>
+            </w:r>
+          </w:p>
+        </w:tc>
+      </w:tr>
+      <w:tr>
+        <w:tblPrEx>
+          <w:tblCellMar>
+            <w:top w:w="0" w:type="dxa"/>
+            <w:bottom w:w="0" w:type="dxa"/>
+          </w:tblCellMar>
+        </w:tblPrEx>
+        <w:tc>
+          <w:tcPr>
+            <w:tcW w:w="2300" w:type="dxa"/>
+            <w:shd w:val="clear" w:color="auto" w:fill="F2F6FA"/>
+            <w:tcMar>
+              <w:top w:w="55" w:type="dxa"/>
+              <w:left w:w="85" w:type="dxa"/>
+              <w:bottom w:w="55" w:type="dxa"/>
+              <w:right w:w="85" w:type="dxa"/>
+            </w:tcMar>
+          </w:tcPr>
+          <w:p>
+            <w:pPr>
+              <w:bidi w:val="0"/>
+            </w:pPr>
+          </w:p>
+        </w:tc>
+        <w:tc>
+          <w:tcPr>
+            <w:tcW w:w="1250" w:type="dxa"/>
+            <w:shd w:val="clear" w:color="auto" w:fill="F2F6FA"/>
+            <w:tcMar>
+              <w:top w:w="55" w:type="dxa"/>
+              <w:left w:w="85" w:type="dxa"/>
+              <w:bottom w:w="55" w:type="dxa"/>
+              <w:right w:w="85" w:type="dxa"/>
+            </w:tcMar>
+          </w:tcPr>
+          <w:p>
+            <w:pPr>
+              <w:bidi w:val="0"/>
+              <w:jc w:val="center"/>
+            </w:pPr>
+            <w:r>
+              <w:rPr>
+                <w:color w:val="000000"/>
+                <w:sz w:val="18"/>
+                <w:szCs w:val="18"/>
+              </w:rPr>
+              <w:t>Hybrid</w:t>
+            </w:r>
+          </w:p>
+        </w:tc>
+        <w:tc>
+          <w:tcPr>
+            <w:tcW w:w="1400" w:type="dxa"/>
+            <w:shd w:val="clear" w:color="auto" w:fill="F2F6FA"/>
+            <w:tcMar>
+              <w:top w:w="55" w:type="dxa"/>
+              <w:left w:w="85" w:type="dxa"/>
+              <w:bottom w:w="55" w:type="dxa"/>
+              <w:right w:w="85" w:type="dxa"/>
+            </w:tcMar>
+          </w:tcPr>
+          <w:p>
+            <w:pPr>
+              <w:bidi w:val="0"/>
+              <w:jc w:val="center"/>
+            </w:pPr>
+            <w:r>
+              <w:rPr>
+                <w:color w:val="000000"/>
+                <w:sz w:val="18"/>
+                <w:szCs w:val="18"/>
+              </w:rPr>
+              <w:t>62.8%</w:t>
+            </w:r>
+          </w:p>
+        </w:tc>
+        <w:tc>
+          <w:tcPr>
+            <w:tcW w:w="1450" w:type="dxa"/>
+            <w:shd w:val="clear" w:color="auto" w:fill="F2F6FA"/>
+            <w:tcMar>
+              <w:top w:w="55" w:type="dxa"/>
+              <w:left w:w="85" w:type="dxa"/>
+              <w:bottom w:w="55" w:type="dxa"/>
+              <w:right w:w="85" w:type="dxa"/>
+            </w:tcMar>
+          </w:tcPr>
+          <w:p>
+            <w:pPr>
+              <w:bidi w:val="0"/>
+              <w:jc w:val="center"/>
+            </w:pPr>
+            <w:r>
+              <w:rPr>
+                <w:color w:val="000000"/>
+                <w:sz w:val="18"/>
+                <w:szCs w:val="18"/>
+              </w:rPr>
+              <w:t>60.4%</w:t>
+            </w:r>
+          </w:p>
+        </w:tc>
+        <w:tc>
+          <w:tcPr>
+            <w:tcW w:w="1300" w:type="dxa"/>
+            <w:shd w:val="clear" w:color="auto" w:fill="F2F6FA"/>
+            <w:tcMar>
+              <w:top w:w="55" w:type="dxa"/>
+              <w:left w:w="85" w:type="dxa"/>
+              <w:bottom w:w="55" w:type="dxa"/>
+              <w:right w:w="85" w:type="dxa"/>
+            </w:tcMar>
+          </w:tcPr>
+          <w:p>
+            <w:pPr>
+              <w:bidi w:val="0"/>
+              <w:jc w:val="center"/>
+            </w:pPr>
+            <w:r>
+              <w:rPr>
+                <w:color w:val="000000"/>
+                <w:sz w:val="18"/>
+                <w:szCs w:val="18"/>
+              </w:rPr>
+              <w:t>61.5</w:t>
+            </w:r>
+          </w:p>
+        </w:tc>
+        <w:tc>
+          <w:tcPr>
+            <w:tcW w:w="1300" w:type="dxa"/>
+            <w:shd w:val="clear" w:color="auto" w:fill="F2F6FA"/>
+            <w:tcMar>
+              <w:top w:w="55" w:type="dxa"/>
+              <w:left w:w="85" w:type="dxa"/>
+              <w:bottom w:w="55" w:type="dxa"/>
+              <w:right w:w="85" w:type="dxa"/>
+            </w:tcMar>
+          </w:tcPr>
+          <w:p>
+            <w:pPr>
+              <w:bidi w:val="0"/>
+              <w:jc w:val="center"/>
+            </w:pPr>
+            <w:r>
+              <w:rPr>
+                <w:color w:val="000000"/>
+                <w:sz w:val="18"/>
+                <w:szCs w:val="18"/>
+              </w:rPr>
+              <w:t>62.5</w:t>
+            </w:r>
+          </w:p>
+        </w:tc>
+      </w:tr>
+      <w:tr>
+        <w:tblPrEx>
+          <w:tblCellMar>
+            <w:top w:w="0" w:type="dxa"/>
+            <w:bottom w:w="0" w:type="dxa"/>
+          </w:tblCellMar>
+        </w:tblPrEx>
+        <w:tc>
+          <w:tcPr>
+            <w:tcW w:w="2300" w:type="dxa"/>
             <w:shd w:val="clear" w:color="auto" w:fill="DCE9F7"/>
             <w:tcMar>
               <w:top w:w="55" w:type="dxa"/>
@@ -15145,7 +15604,7 @@
         </w:tc>
         <w:tc>
           <w:tcPr>
-            <w:tcW w:w="1350" w:type="dxa"/>
+            <w:tcW w:w="1250" w:type="dxa"/>
             <w:shd w:val="clear" w:color="auto" w:fill="DCE9F7"/>
             <w:tcMar>
               <w:top w:w="55" w:type="dxa"/>
@@ -15167,13 +15626,13 @@
                 <w:sz w:val="18"/>
                 <w:szCs w:val="18"/>
               </w:rPr>
-              <w:t>68.5%</w:t>
-            </w:r>
-          </w:p>
-        </w:tc>
-        <w:tc>
-          <w:tcPr>
-            <w:tcW w:w="1350" w:type="dxa"/>
+              <w:t>Static</w:t>
+            </w:r>
+          </w:p>
+        </w:tc>
+        <w:tc>
+          <w:tcPr>
+            <w:tcW w:w="1400" w:type="dxa"/>
             <w:shd w:val="clear" w:color="auto" w:fill="DCE9F7"/>
             <w:tcMar>
               <w:top w:w="55" w:type="dxa"/>
@@ -15195,13 +15654,13 @@
                 <w:sz w:val="18"/>
                 <w:szCs w:val="18"/>
               </w:rPr>
-              <w:t>80.5%</w:t>
-            </w:r>
-          </w:p>
-        </w:tc>
-        <w:tc>
-          <w:tcPr>
-            <w:tcW w:w="1350" w:type="dxa"/>
+              <w:t>68.5%</w:t>
+            </w:r>
+          </w:p>
+        </w:tc>
+        <w:tc>
+          <w:tcPr>
+            <w:tcW w:w="1450" w:type="dxa"/>
             <w:shd w:val="clear" w:color="auto" w:fill="DCE9F7"/>
             <w:tcMar>
               <w:top w:w="55" w:type="dxa"/>
@@ -15223,13 +15682,13 @@
                 <w:sz w:val="18"/>
                 <w:szCs w:val="18"/>
               </w:rPr>
-              <w:t>68.4</w:t>
-            </w:r>
-          </w:p>
-        </w:tc>
-        <w:tc>
-          <w:tcPr>
-            <w:tcW w:w="1350" w:type="dxa"/>
+              <w:t>68.0%</w:t>
+            </w:r>
+          </w:p>
+        </w:tc>
+        <w:tc>
+          <w:tcPr>
+            <w:tcW w:w="1300" w:type="dxa"/>
             <w:shd w:val="clear" w:color="auto" w:fill="DCE9F7"/>
             <w:tcMar>
               <w:top w:w="55" w:type="dxa"/>
@@ -15251,13 +15710,13 @@
                 <w:sz w:val="18"/>
                 <w:szCs w:val="18"/>
               </w:rPr>
-              <w:t>78.8</w:t>
-            </w:r>
-          </w:p>
-        </w:tc>
-        <w:tc>
-          <w:tcPr>
-            <w:tcW w:w="1876" w:type="dxa"/>
+              <w:t>68.2</w:t>
+            </w:r>
+          </w:p>
+        </w:tc>
+        <w:tc>
+          <w:tcPr>
+            <w:tcW w:w="1300" w:type="dxa"/>
             <w:shd w:val="clear" w:color="auto" w:fill="DCE9F7"/>
             <w:tcMar>
               <w:top w:w="55" w:type="dxa"/>
@@ -15279,7 +15738,172 @@
                 <w:sz w:val="18"/>
                 <w:szCs w:val="18"/>
               </w:rPr>
-              <w:t>+10.4</w:t>
+              <w:t>68.4</w:t>
+            </w:r>
+          </w:p>
+        </w:tc>
+      </w:tr>
+      <w:tr>
+        <w:tblPrEx>
+          <w:tblCellMar>
+            <w:top w:w="0" w:type="dxa"/>
+            <w:bottom w:w="0" w:type="dxa"/>
+          </w:tblCellMar>
+        </w:tblPrEx>
+        <w:tc>
+          <w:tcPr>
+            <w:tcW w:w="2300" w:type="dxa"/>
+            <w:shd w:val="clear" w:color="auto" w:fill="DCE9F7"/>
+            <w:tcMar>
+              <w:top w:w="55" w:type="dxa"/>
+              <w:left w:w="85" w:type="dxa"/>
+              <w:bottom w:w="55" w:type="dxa"/>
+              <w:right w:w="85" w:type="dxa"/>
+            </w:tcMar>
+          </w:tcPr>
+          <w:p>
+            <w:pPr>
+              <w:bidi w:val="0"/>
+            </w:pPr>
+          </w:p>
+        </w:tc>
+        <w:tc>
+          <w:tcPr>
+            <w:tcW w:w="1250" w:type="dxa"/>
+            <w:shd w:val="clear" w:color="auto" w:fill="DCE9F7"/>
+            <w:tcMar>
+              <w:top w:w="55" w:type="dxa"/>
+              <w:left w:w="85" w:type="dxa"/>
+              <w:bottom w:w="55" w:type="dxa"/>
+              <w:right w:w="85" w:type="dxa"/>
+            </w:tcMar>
+          </w:tcPr>
+          <w:p>
+            <w:pPr>
+              <w:bidi w:val="0"/>
+              <w:jc w:val="center"/>
+            </w:pPr>
+            <w:r>
+              <w:rPr>
+                <w:b/>
+                <w:bCs/>
+                <w:color w:val="000000"/>
+                <w:sz w:val="18"/>
+                <w:szCs w:val="18"/>
+              </w:rPr>
+              <w:t>Hybrid</w:t>
+            </w:r>
+          </w:p>
+        </w:tc>
+        <w:tc>
+          <w:tcPr>
+            <w:tcW w:w="1400" w:type="dxa"/>
+            <w:shd w:val="clear" w:color="auto" w:fill="DCE9F7"/>
+            <w:tcMar>
+              <w:top w:w="55" w:type="dxa"/>
+              <w:left w:w="85" w:type="dxa"/>
+              <w:bottom w:w="55" w:type="dxa"/>
+              <w:right w:w="85" w:type="dxa"/>
+            </w:tcMar>
+          </w:tcPr>
+          <w:p>
+            <w:pPr>
+              <w:bidi w:val="0"/>
+              <w:jc w:val="center"/>
+            </w:pPr>
+            <w:r>
+              <w:rPr>
+                <w:b/>
+                <w:bCs/>
+                <w:color w:val="000000"/>
+                <w:sz w:val="18"/>
+                <w:szCs w:val="18"/>
+              </w:rPr>
+              <w:t>80.5%</w:t>
+            </w:r>
+          </w:p>
+        </w:tc>
+        <w:tc>
+          <w:tcPr>
+            <w:tcW w:w="1450" w:type="dxa"/>
+            <w:shd w:val="clear" w:color="auto" w:fill="DCE9F7"/>
+            <w:tcMar>
+              <w:top w:w="55" w:type="dxa"/>
+              <w:left w:w="85" w:type="dxa"/>
+              <w:bottom w:w="55" w:type="dxa"/>
+              <w:right w:w="85" w:type="dxa"/>
+            </w:tcMar>
+          </w:tcPr>
+          <w:p>
+            <w:pPr>
+              <w:bidi w:val="0"/>
+              <w:jc w:val="center"/>
+            </w:pPr>
+            <w:r>
+              <w:rPr>
+                <w:b/>
+                <w:bCs/>
+                <w:color w:val="000000"/>
+                <w:sz w:val="18"/>
+                <w:szCs w:val="18"/>
+              </w:rPr>
+              <w:t>66.1%</w:t>
+            </w:r>
+          </w:p>
+        </w:tc>
+        <w:tc>
+          <w:tcPr>
+            <w:tcW w:w="1300" w:type="dxa"/>
+            <w:shd w:val="clear" w:color="auto" w:fill="DCE9F7"/>
+            <w:tcMar>
+              <w:top w:w="55" w:type="dxa"/>
+              <w:left w:w="85" w:type="dxa"/>
+              <w:bottom w:w="55" w:type="dxa"/>
+              <w:right w:w="85" w:type="dxa"/>
+            </w:tcMar>
+          </w:tcPr>
+          <w:p>
+            <w:pPr>
+              <w:bidi w:val="0"/>
+              <w:jc w:val="center"/>
+            </w:pPr>
+            <w:r>
+              <w:rPr>
+                <w:b/>
+                <w:bCs/>
+                <w:color w:val="000000"/>
+                <w:sz w:val="18"/>
+                <w:szCs w:val="18"/>
+              </w:rPr>
+              <w:t>72.6</w:t>
+            </w:r>
+          </w:p>
+        </w:tc>
+        <w:tc>
+          <w:tcPr>
+            <w:tcW w:w="1300" w:type="dxa"/>
+            <w:shd w:val="clear" w:color="auto" w:fill="DCE9F7"/>
+            <w:tcMar>
+              <w:top w:w="55" w:type="dxa"/>
+              <w:left w:w="85" w:type="dxa"/>
+              <w:bottom w:w="55" w:type="dxa"/>
+              <w:right w:w="85" w:type="dxa"/>
+            </w:tcMar>
+          </w:tcPr>
+          <w:p>
+            <w:pPr>
+              <w:bidi w:val="0"/>
+              <w:jc w:val="center"/>
+            </w:pPr>
+            <w:r>
+              <w:rPr>
+                <w:b/>
+                <w:bCs/>
+                <w:color w:val="000000"/>
+                <w:sz w:val="18"/>
+                <w:szCs w:val="18"/>
+              </w:rPr>
+              <w:t>78.8</w:t>
             </w:r>
           </w:p>
         </w:tc>
@@ -15345,10 +15969,10 @@
         <w:spacing w:after="80"/>
       </w:pPr>
       <w:r>
-        <w:t xml:space="preserve">F1 improves on Java (75.7 to 78.0) and C (53.9 </w:t>
-      </w:r>
-      <w:r>
-        <w:t>to 61.5). It declines on Python (67.5 to 59.9), the only metric in any language where the hybrid is worse.</w:t>
+        <w:t>F1, which weights precision and recall equally,</w:t>
+      </w:r>
+      <w:r>
+        <w:t xml:space="preserve"> improves on Java (75.7 to 78.0), on C (53.9 to 61.5) and on the two combined (68.2 to 72.6). It declines on Python alone (67.5 to 59.9).</w:t>
       </w:r>
     </w:p>
     <w:p>
@@ -15374,10 +15998,10 @@
         <w:spacing w:after="80"/>
       </w:pPr>
       <w:r>
-        <w:t>The model is the only source of repairs. The analyzer produces none, by co</w:t>
-      </w:r>
-      <w:r>
-        <w:t>nstruction - pattern matching cannot rewrite a concatenated query into a prepared statement while preserving the surrounding exception handling. Repair quality is evaluated separately.</w:t>
+        <w:t>The model is the only source of repairs. Th</w:t>
+      </w:r>
+      <w:r>
+        <w:t>e analyzer produces none, by construction - pattern matching cannot rewrite a concatenated query into a prepared statement while preserving the surrounding exception handling.</w:t>
       </w:r>
     </w:p>
     <w:p>
@@ -15402,13 +16026,16 @@
         <w:spacing w:after="130" w:line="278" w:lineRule="auto"/>
       </w:pPr>
       <w:r>
-        <w:t>The hybrid's precision is lower in every l</w:t>
-      </w:r>
-      <w:r>
-        <w:t>anguage, and on Python it is materially lower - 49.5% against 67.7%. The model contributes 100 findings at locations RealVuln did not label. Under a precision-weighted metric the static analyzer alone is the better tool on Python, and the frontier language</w:t>
-      </w:r>
-      <w:r>
-        <w:t>-model scanners are better still.</w:t>
+        <w:t>Precision m</w:t>
+      </w:r>
+      <w:r>
+        <w:t xml:space="preserve">oves in different directions by language. It falls on Python, materially so, at 49.5% against 67.7%, because the model contributes 100 findings at locations RealVuln did not label. It falls on Java, from 74.0% to 68.6%. On C it rises, from 55.8% to 60.4%, </w:t>
+      </w:r>
+      <w:r>
+        <w:t>because there the model recovers true positives the analyzer missed without adding false ones of its own. Across Java and C together the net effect is a modest decline, from 68.0% to 66.1%, set against a twelve-point recall gain. Only on Python is the prec</w:t>
+      </w:r>
+      <w:r>
+        <w:t>ision cost large enough that a precision-weighted metric favours the static analyzer alone, and there the frontier language-model scanners are better still.</w:t>
       </w:r>
     </w:p>
     <w:p>
@@ -15417,10 +16044,13 @@
         <w:spacing w:after="130" w:line="278" w:lineRule="auto"/>
       </w:pPr>
       <w:r>
-        <w:t>The decision therefore rests on which error is more expensive. For a tool that surfaces findings inline in the editor, where dismissing a false positive costs one click and a suppression is remembered permanently, a missed</w:t>
-      </w:r>
-      <w:r>
-        <w:t xml:space="preserve"> vulnerability is the more expensive error by a wide margin. That is also the position RealVuln takes in choosing F3 as its headline metric.</w:t>
+        <w:t>The decision therefore rests on which error is more expensive. For a tool that surfaces findings in</w:t>
+      </w:r>
+      <w:r>
+        <w:t xml:space="preserve">line in the editor, where dismissing a false positive costs one click and a suppression is remembered permanently, a missed vulnerability is the more expensive error by a wide margin. That is also the position RealVuln takes in choosing F3 as its headline </w:t>
+      </w:r>
+      <w:r>
+        <w:t>metric.</w:t>
       </w:r>
     </w:p>
     <w:p>
@@ -15441,7 +16071,7 @@
           <w:sz w:val="20"/>
           <w:szCs w:val="20"/>
         </w:rPr>
-        <w:t>On these results the hybrid is the more suitable default. It improves recall and F3 in all three languages, its largest gains fall where the analyzer is weakest, and it is the only configuration capable of producing a fix. The static layer remains the alwa</w:t>
+        <w:t xml:space="preserve">On these results the hybrid is the more suitable default. It improves recall and F3 in all three languages, its largest gains fall where the analyzer is weakest, and it is the only configuration capable of producing a fix. The static layer remains </w:t>
       </w:r>
       <w:r>
         <w:rPr>
@@ -15451,7 +16081,7 @@
           <w:sz w:val="20"/>
           <w:szCs w:val="20"/>
         </w:rPr>
-        <w:t>ys-on path - deterministic, immediate and requiring no GPU - with the model invoked deliberately.</w:t>
+        <w:t>the always-on path - deterministic, immediate and requiring no GPU - with the model invoked deliberately.</w:t>
       </w:r>
     </w:p>
     <w:p>
@@ -15476,10 +16106,14 @@
         <w:spacing w:after="130" w:line="278" w:lineRule="auto"/>
       </w:pPr>
       <w:r>
-        <w:t xml:space="preserve">The model's aggregate precision across the synthetic benchmarks is 75.3% against the analyzer's 68.0%, and on C it reaches </w:t>
-      </w:r>
-      <w:r>
-        <w:t>97.7%. On CWE-190 it rejected every one of the analyzer's 92 false positives. The present design cannot exploit this, because the hybrid takes the union of both sources and a union can only add findings, never withdraw them.</w:t>
+        <w:t xml:space="preserve">The model's aggregate precision across the synthetic benchmarks is 75.3% against the analyzer's 68.0%, and on C it </w:t>
+      </w:r>
+      <w:r>
+        <w:t xml:space="preserve">reaches 97.7%. On CWE-190 it rejected every one of the analyzer's 92 false positives. The present </w:t>
+      </w:r>
+      <w:r>
+        <w:lastRenderedPageBreak/>
+        <w:t>design cannot exploit this, because the hybrid takes the union of both sources and a union can only add findings, never withdraw them.</w:t>
       </w:r>
     </w:p>
     <w:p>
@@ -15488,13 +16122,13 @@
         <w:spacing w:after="130" w:line="278" w:lineRule="auto"/>
       </w:pPr>
       <w:r>
-        <w:t>A configuration in which the mo</w:t>
-      </w:r>
-      <w:r>
-        <w:t>del adjudicates the analyzer's findings rather than extending them is therefore the clearest available improvement, and it is supported by the literature: the 2026 study cited above reports LLM-based post-filtering reducing false-positive rates from over 9</w:t>
-      </w:r>
-      <w:r>
-        <w:t>2% to 6.3%. This is the primary direction for future work.</w:t>
+        <w:t>A configuration in whic</w:t>
+      </w:r>
+      <w:r>
+        <w:t>h the model adjudicates the analyzer's findings rather than extending them is therefore the clearest available improvement, and it is supported by the literature: the 2026 study cited above reports LLM-based post-filtering reducing false-positive rates fro</w:t>
+      </w:r>
+      <w:r>
+        <w:t>m over 92% to 6.3%. This is the primary direction for future work.</w:t>
       </w:r>
     </w:p>
     <w:p>
@@ -15531,10 +16165,10 @@
         <w:spacing w:after="130" w:line="278" w:lineRule="auto"/>
       </w:pPr>
       <w:r>
-        <w:t>The false-positive rates on OWASP's taint categories - 74% on SQL injection, 60% on command injection, 55% on path traversal - demand an explana</w:t>
-      </w:r>
-      <w:r>
-        <w:t>tion, particularly alongside a 21.2% trap rate on real applications. Every OWASP case flagged as vulnerable but labelled safe was therefore classified by the mechanism that makes it safe.</w:t>
+        <w:t>The false-positive rates on OWASP's taint categories - 74% on SQL injection, 60% on command injection, 55% on path traversal - demand an</w:t>
+      </w:r>
+      <w:r>
+        <w:t xml:space="preserve"> explanation, particularly alongside a 21.2% trap rate on real applications. Every OWASP case flagged as vulnerable but labelled safe was therefore classified by the mechanism that makes it safe.</w:t>
       </w:r>
     </w:p>
     <w:tbl>
@@ -16492,15 +17126,7 @@
           <w:sz w:val="17"/>
           <w:szCs w:val="17"/>
         </w:rPr>
-        <w:t>PreparedStatement statement = connection.prepareSt</w:t>
-      </w:r>
-      <w:r>
-        <w:rPr>
-          <w:rFonts w:ascii="Consolas" w:eastAsia="Consolas" w:hAnsi="Consolas" w:cs="Consolas"/>
-          <w:sz w:val="17"/>
-          <w:szCs w:val="17"/>
-        </w:rPr>
-        <w:t>atement(sql);</w:t>
+        <w:t>PreparedStatement statement = connection.prepareStatement(sql);</w:t>
       </w:r>
     </w:p>
     <w:p>
@@ -16713,7 +17339,10 @@
         <w:spacing w:after="80"/>
       </w:pPr>
       <w:r>
-        <w:t>Precision relative to language-model scanners remains the analyzer's principal weakness: 67.7% against 86-91% on RealVuln.</w:t>
+        <w:t>Precision relative to lang</w:t>
+      </w:r>
+      <w:r>
+        <w:t>uage-model scanners remains the analyzer's principal weakness: 67.7% against 86-91% on RealVuln.</w:t>
       </w:r>
     </w:p>
     <w:p>
@@ -16722,10 +17351,10 @@
         <w:spacing w:after="130" w:line="278" w:lineRule="auto"/>
       </w:pPr>
       <w:r>
-        <w:t>Approximately 20% of observed false positives are addressable with field-sensitive container modelling and constant propagation, both</w:t>
-      </w:r>
-      <w:r>
-        <w:t xml:space="preserve"> well-understood techniques. The remaining 80% require whole-program reflection analysis representing years of dedicated engineering.</w:t>
+        <w:t>Approximately 20% of observed false positives are addressable with field-sensitive container modelling and constant propagation, both well-understood technique</w:t>
+      </w:r>
+      <w:r>
+        <w:t>s. The remaining 80% require whole-program reflection analysis representing years of dedicated engineering.</w:t>
       </w:r>
     </w:p>
     <w:p>
@@ -16910,6 +17539,15 @@
     </w:p>
     <w:p>
       <w:pPr>
+        <w:bidi w:val="0"/>
+        <w:spacing w:after="130" w:line="278" w:lineRule="auto"/>
+      </w:pPr>
+      <w:r>
+        <w:t>All links accessed 4 August 2026.</w:t>
+      </w:r>
+    </w:p>
+    <w:p>
+      <w:pPr>
         <w:pStyle w:val="Heading3"/>
         <w:spacing w:before="200" w:after="90"/>
       </w:pPr>
@@ -16921,17 +17559,7 @@
           <w:sz w:val="21"/>
           <w:szCs w:val="21"/>
         </w:rPr>
-        <w:t>B</w:t>
-      </w:r>
-      <w:r>
-        <w:rPr>
-          <w:b/>
-          <w:bCs/>
-          <w:color w:val="2E75B6"/>
-          <w:sz w:val="21"/>
-          <w:szCs w:val="21"/>
-        </w:rPr>
-        <w:t>enchmarks and corpora</w:t>
+        <w:t>Benchmarks and corpora</w:t>
       </w:r>
     </w:p>
     <w:p>
@@ -16955,14 +17583,14 @@
           <w:sz w:val="20"/>
           <w:szCs w:val="20"/>
         </w:rPr>
-        <w:t>OWASP Foundation. OWASP Benchmark Project, versio</w:t>
+        <w:t xml:space="preserve">OWASP Foundation. OWASP Benchmark Project, version 1.2. Java test suite of </w:t>
       </w:r>
       <w:r>
         <w:rPr>
           <w:sz w:val="20"/>
           <w:szCs w:val="20"/>
         </w:rPr>
-        <w:t xml:space="preserve">n 1.2. Java test suite of 2,740 cases with published expected results. </w:t>
+        <w:t xml:space="preserve">2,740 cases with published expected results. </w:t>
       </w:r>
       <w:hyperlink r:id="rId5" w:history="1">
         <w:r>
@@ -17127,14 +17755,7 @@
           <w:sz w:val="20"/>
           <w:szCs w:val="20"/>
         </w:rPr>
-        <w:t>RealVuln</w:t>
-      </w:r>
-      <w:r>
-        <w:rPr>
-          <w:sz w:val="20"/>
-          <w:szCs w:val="20"/>
-        </w:rPr>
-        <w:t xml:space="preserve">: Benchmarking Rule-Based, General-Purpose LLM, and Security-Specialized Scanners on Real-World Code. arXiv preprint arXiv:2604.13764, 2026. Source of the F3 metric and of the scanner outputs re-scored in Section 3.2. </w:t>
+        <w:t xml:space="preserve">RealVuln: Benchmarking Rule-Based, General-Purpose LLM, and Security-Specialized Scanners on Real-World Code. arXiv preprint arXiv:2604.13764, 2026. Source of the F3 metric and of the scanner outputs re-scored in Section 3.2. </w:t>
       </w:r>
       <w:hyperlink r:id="rId9" w:history="1">
         <w:r>
@@ -17169,14 +17790,14 @@
           <w:sz w:val="20"/>
           <w:szCs w:val="20"/>
         </w:rPr>
-        <w:t>Sifting the Noise: A Comparative Study of LLM Agents in Vulnerability False Positive Filtering. arXiv preprint arXiv:2601.22952, 2026. CodeQL, Semgrep, SonarQube and Joern on OWASP Benchmark v1.2; false-posi</w:t>
+        <w:t>Sifting the Noise: A Comparative Study of LLM Agents in Vulnerability False Positive Filtering. arXiv preprint arXiv:2601.22952, 2026. CodeQL, Semgrep, SonarQube and Joern on OWASP Benchmark v1.2; fa</w:t>
       </w:r>
       <w:r>
         <w:rPr>
           <w:sz w:val="20"/>
           <w:szCs w:val="20"/>
         </w:rPr>
-        <w:t xml:space="preserve">tive rates quoted from Section 4.1, table “Initial Performance of SAST Tools Across All Instances”, and per-CWE figures from the accompanying FPR heatmap. </w:t>
+        <w:t xml:space="preserve">lse-positive rates quoted from Section 4.1, table “Initial Performance of SAST Tools Across All Instances”, and per-CWE figures from the accompanying FPR heatmap. </w:t>
       </w:r>
       <w:hyperlink r:id="rId10" w:history="1">
         <w:r>
@@ -17211,21 +17832,21 @@
           <w:sz w:val="20"/>
           <w:szCs w:val="20"/>
         </w:rPr>
-        <w:t xml:space="preserve">Dubniczky, R. </w:t>
+        <w:t>Dubnic</w:t>
       </w:r>
       <w:r>
         <w:rPr>
           <w:sz w:val="20"/>
           <w:szCs w:val="20"/>
         </w:rPr>
-        <w:t>A. et al. CASTLE: Benchmarking Dataset for Static Code Analyzers and LLMs towards CWE Detection. arXiv preprint arXiv:2503.09433, 2025. Thirteen static analyzers, two formal verification tools and ten LLMs evaluated on 250 hand-written C programs across 25</w:t>
+        <w:t>zky, R. A. et al. CASTLE: Benchmarking Dataset for Static Code Analyzers and LLMs towards CWE Detection. arXiv preprint arXiv:2503.09433, 2025. Thirteen static analyzers, two formal verification tools and ten LLMs evaluated on 250 hand-written C programs a</w:t>
       </w:r>
       <w:r>
         <w:rPr>
           <w:sz w:val="20"/>
           <w:szCs w:val="20"/>
         </w:rPr>
-        <w:t xml:space="preserve"> CWEs; source of the per-tool recall and precision figures in Section 5.2. </w:t>
+        <w:t xml:space="preserve">cross 25 CWEs; source of the per-tool recall and precision figures in Section 5.2. </w:t>
       </w:r>
       <w:hyperlink r:id="rId11" w:history="1">
         <w:r>
@@ -17260,14 +17881,14 @@
           <w:sz w:val="20"/>
           <w:szCs w:val="20"/>
         </w:rPr>
-        <w:t>A Systematic Literature Review on Static Application Security Testing (SAST) Tools: Evaluation</w:t>
+        <w:t>A Systematic Literature Review on Static Application Security Testing (SAST) Tools: Ev</w:t>
       </w:r>
       <w:r>
         <w:rPr>
           <w:sz w:val="20"/>
           <w:szCs w:val="20"/>
         </w:rPr>
-        <w:t xml:space="preserve">, Benchmarks, Challenges, and Future Directions. In Proceedings of the 29th International Conference on Evaluation and Assessment in Software Engineering (EASE ’25), Companion. ACM, 2025. </w:t>
+        <w:t xml:space="preserve">aluation, Benchmarks, Challenges, and Future Directions. In Proceedings of the 29th International Conference on Evaluation and Assessment in Software Engineering (EASE ’25), Companion. ACM, 2025. </w:t>
       </w:r>
       <w:hyperlink r:id="rId12" w:history="1">
         <w:r>
@@ -17277,7 +17898,7 @@
             <w:szCs w:val="20"/>
             <w:u w:val="single"/>
           </w:rPr>
-          <w:t>https://doi.</w:t>
+          <w:t>http</w:t>
         </w:r>
         <w:r>
           <w:rPr>
@@ -17286,7 +17907,7 @@
             <w:szCs w:val="20"/>
             <w:u w:val="single"/>
           </w:rPr>
-          <w:t>org/10.1145/3727967.3756838</w:t>
+          <w:t>s://doi.org/10.1145/3727967.3756838</w:t>
         </w:r>
       </w:hyperlink>
     </w:p>
@@ -17311,14 +17932,14 @@
           <w:sz w:val="20"/>
           <w:szCs w:val="20"/>
         </w:rPr>
-        <w:t>Gentsch, C., Krishnamurthy, R. and Heinze, T. S. Benchmarking Open-Source Static Analyzers for Security Testing for C. In Leveraging Applications of Formal Methods, Verification and Validation (ISoLA 2020), LNCS 12479, Spri</w:t>
+        <w:t>Gentsch, C., Krishnamurthy, R. and Heinze, T. S. Benchmarking Open-Source Static Analyzers for Security Testing for C. In Leveraging Applications of Formal Methods, Verification and Validation (ISoLA 2020), LNCS 124</w:t>
       </w:r>
       <w:r>
         <w:rPr>
           <w:sz w:val="20"/>
           <w:szCs w:val="20"/>
         </w:rPr>
-        <w:t xml:space="preserve">nger, 2021, pp. 182-198. Eleven open-source analyzers evaluated on the Juliet Test Suite 1.3 for C; source of the per-tool recall and precision figures in Section 5.2. Extended results appear in DLR technical report DLR-IB-DW-JE-2020-16. </w:t>
+        <w:t xml:space="preserve">79, Springer, 2021, pp. 182-198. Eleven open-source analyzers evaluated on the Juliet Test Suite 1.3 for C; source of the per-tool recall and precision figures in Section 5.2. Extended results appear in DLR technical report DLR-IB-DW-JE-2020-16. </w:t>
       </w:r>
       <w:hyperlink r:id="rId13" w:history="1">
         <w:r>
@@ -17353,14 +17974,14 @@
           <w:sz w:val="20"/>
           <w:szCs w:val="20"/>
         </w:rPr>
-        <w:t>Lipp, S., Banescu, S. and Pretschner, A. An Empirical Study on the Effectiveness of Static C Code Analyzers for Vulnerability Detection. In Proceedings of the 31st ACM SIGSOFT International Symposium on Software Testing and Analysis (ISSTA 2022), pp. 544-5</w:t>
+        <w:t>Lipp, S., Banescu, S. and Pretschner, A. An Empirical Study on the Effectiveness of Static C Code Analyzers for Vulnerability Detection. In Pr</w:t>
       </w:r>
       <w:r>
         <w:rPr>
           <w:sz w:val="20"/>
           <w:szCs w:val="20"/>
         </w:rPr>
-        <w:t xml:space="preserve">55. Eleven analyzers evaluated against 192 real-world CVEs in C; source of the commercial and open-source recall figures in Section 5.2. </w:t>
+        <w:t xml:space="preserve">oceedings of the 31st ACM SIGSOFT International Symposium on Software Testing and Analysis (ISSTA 2022), pp. 544-555. Eleven analyzers evaluated against 192 real-world CVEs in C; source of the commercial and open-source recall figures in Section 5.2. </w:t>
       </w:r>
       <w:hyperlink r:id="rId14" w:history="1">
         <w:r>
@@ -17395,14 +18016,7 @@
           <w:sz w:val="20"/>
           <w:szCs w:val="20"/>
         </w:rPr>
-        <w:t>Del</w:t>
-      </w:r>
-      <w:r>
-        <w:rPr>
-          <w:sz w:val="20"/>
-          <w:szCs w:val="20"/>
-        </w:rPr>
-        <w:t xml:space="preserve">aitre, A. et al. SATE V Report: Ten Years of Static Analysis Tool Expositions. NIST Special Publication 500-326, 2018. </w:t>
+        <w:t xml:space="preserve">Delaitre, A. et al. SATE V Report: Ten Years of Static Analysis Tool Expositions. NIST Special Publication 500-326, 2018. </w:t>
       </w:r>
       <w:hyperlink r:id="rId15" w:history="1">
         <w:r>
@@ -17437,14 +18051,7 @@
           <w:sz w:val="20"/>
           <w:szCs w:val="20"/>
         </w:rPr>
-        <w:t>Youden, W. J. Index for rating diag</w:t>
-      </w:r>
-      <w:r>
-        <w:rPr>
-          <w:sz w:val="20"/>
-          <w:szCs w:val="20"/>
-        </w:rPr>
-        <w:t xml:space="preserve">nostic tests. Cancer, vol. 3, no. 1, 1950, pp. 32-35. Origin of the Youden J statistic used as the OWASP Benchmark metric. </w:t>
+        <w:t xml:space="preserve">Youden, W. J. Index for rating diagnostic tests. Cancer, vol. 3, no. 1, 1950, pp. 32-35. Origin of the Youden J statistic used as the OWASP Benchmark metric. </w:t>
       </w:r>
       <w:hyperlink r:id="rId16" w:history="1">
         <w:r>
@@ -17454,16 +18061,7 @@
             <w:szCs w:val="20"/>
             <w:u w:val="single"/>
           </w:rPr>
-          <w:t>https://doi.org/10.1002/1097-0142(19</w:t>
-        </w:r>
-        <w:r>
-          <w:rPr>
-            <w:color w:val="0563C1"/>
-            <w:sz w:val="20"/>
-            <w:szCs w:val="20"/>
-            <w:u w:val="single"/>
-          </w:rPr>
-          <w:t>50)3:1%3C32::AID-CNCR2820030106%3E3.0.CO;2-3</w:t>
+          <w:t>https://doi.org/10.1002/1097-0142(1950)3:1%3C32::AID-CNCR2820030106%3E3.0.CO;2-3</w:t>
         </w:r>
       </w:hyperlink>
     </w:p>
@@ -17506,7 +18104,15 @@
           <w:szCs w:val="20"/>
           <w:lang w:val="fr-FR"/>
         </w:rPr>
-        <w:t xml:space="preserve">Hui, B. et al. Qwen2.5-Coder Technical Report. arXiv preprint arXiv:2409.12186, 2024. </w:t>
+        <w:t>Hui, B. et al. Qwen2.5-Coder Technical Report. arXiv preprint arXiv:2409.</w:t>
+      </w:r>
+      <w:r>
+        <w:rPr>
+          <w:sz w:val="20"/>
+          <w:szCs w:val="20"/>
+          <w:lang w:val="fr-FR"/>
+        </w:rPr>
+        <w:t xml:space="preserve">12186, 2024. </w:t>
       </w:r>
       <w:r>
         <w:rPr>
@@ -17523,16 +18129,7 @@
             <w:szCs w:val="20"/>
             <w:u w:val="single"/>
           </w:rPr>
-          <w:t>https://arxi</w:t>
-        </w:r>
-        <w:r>
-          <w:rPr>
-            <w:color w:val="0563C1"/>
-            <w:sz w:val="20"/>
-            <w:szCs w:val="20"/>
-            <w:u w:val="single"/>
-          </w:rPr>
-          <w:t>v.org/abs/2409.12186</w:t>
+          <w:t>https://arxiv.org/abs/2409.12186</w:t>
         </w:r>
       </w:hyperlink>
     </w:p>
@@ -17557,7 +18154,14 @@
           <w:sz w:val="20"/>
           <w:szCs w:val="20"/>
         </w:rPr>
-        <w:t xml:space="preserve">Dettmers, T., Pagnoni, A., Holtzman, A. and Zettlemoyer, L. QLoRA: Efficient Finetuning of Quantized LLMs. In Advances in Neural Information Processing Systems 36 (NeurIPS 2023), arXiv:2305.14314. Fine-tuning method used. </w:t>
+        <w:t>Dettmers, T., Pagnoni, A., Holtzman, A. and Zettlemoyer, L. QLoRA: Efficient Finetuning of Quantized LLMs. In Advan</w:t>
+      </w:r>
+      <w:r>
+        <w:rPr>
+          <w:sz w:val="20"/>
+          <w:szCs w:val="20"/>
+        </w:rPr>
+        <w:t xml:space="preserve">ces in Neural Information Processing Systems 36 (NeurIPS 2023), arXiv:2305.14314. Fine-tuning method used. </w:t>
       </w:r>
       <w:hyperlink r:id="rId18" w:history="1">
         <w:r>
@@ -17585,6 +18189,7 @@
           <w:sz w:val="20"/>
           <w:szCs w:val="20"/>
         </w:rPr>
+        <w:lastRenderedPageBreak/>
         <w:t xml:space="preserve">[15]  </w:t>
       </w:r>
       <w:r>
@@ -17602,16 +18207,7 @@
             <w:szCs w:val="20"/>
             <w:u w:val="single"/>
           </w:rPr>
-          <w:t>https://tree-sitter.github.io</w:t>
-        </w:r>
-        <w:r>
-          <w:rPr>
-            <w:color w:val="0563C1"/>
-            <w:sz w:val="20"/>
-            <w:szCs w:val="20"/>
-            <w:u w:val="single"/>
-          </w:rPr>
-          <w:t>/tree-sitter/</w:t>
+          <w:t>https://tree-sitter.github.io/tree-sitter/</w:t>
         </w:r>
       </w:hyperlink>
     </w:p>
@@ -17628,10 +18224,10 @@
 <file path=word/numbering.xml><?xml version="1.0" encoding="utf-8"?>
 <w:numbering xmlns:wpc="http://schemas.microsoft.com/office/word/2010/wordprocessingCanvas" xmlns:cx="http://schemas.microsoft.com/office/drawing/2014/chartex" xmlns:cx1="http://schemas.microsoft.com/office/drawing/2015/9/8/chartex" xmlns:cx2="http://schemas.microsoft.com/office/drawing/2015/10/21/chartex" xmlns:cx3="http://schemas.microsoft.com/office/drawing/2016/5/9/chartex" xmlns:cx4="http://schemas.microsoft.com/office/drawing/2016/5/10/chartex" xmlns:cx5="http://schemas.microsoft.com/office/drawing/2016/5/11/chartex" xmlns:cx6="http://schemas.microsoft.com/office/drawing/2016/5/12/chartex" xmlns:cx7="http://schemas.microsoft.com/office/drawing/2016/5/13/chartex" xmlns:cx8="http://schemas.microsoft.com/office/drawing/2016/5/14/chartex" xmlns:mc="http://schemas.openxmlformats.org/markup-compatibility/2006" xmlns:aink="http://schemas.microsoft.com/office/drawing/2016/ink" xmlns:am3d="http://schemas.microsoft.com/office/drawing/2017/model3d" xmlns:o="urn:schemas-microsoft-com:office:office" xmlns:r="http://schemas.openxmlformats.org/officeDocument/2006/relationships" xmlns:m="http://schemas.openxmlformats.org/officeDocument/2006/math" xmlns:v="urn:schemas-microsoft-com:vml" xmlns:wp14="http://schemas.microsoft.com/office/word/2010/wordprocessingDrawing" xmlns:wp="http://schemas.openxmlformats.org/drawingml/2006/wordprocessingDrawing" xmlns:w10="urn:schemas-microsoft-com:office:word" xmlns:w="http://schemas.openxmlformats.org/wordprocessingml/2006/main" xmlns:w14="http://schemas.microsoft.com/office/word/2010/wordml" xmlns:w15="http://schemas.microsoft.com/office/word/2012/wordml" xmlns:w16cex="http://schemas.microsoft.com/office/word/2018/wordml/cex" xmlns:w16cid="http://schemas.microsoft.com/office/word/2016/wordml/cid" xmlns:w16="http://schemas.microsoft.com/office/word/2018/wordml" xmlns:w16sdtdh="http://schemas.microsoft.com/office/word/2020/wordml/sdtdatahash" xmlns:w16se="http://schemas.microsoft.com/office/word/2015/wordml/symex" xmlns:wpg="http://schemas.microsoft.com/office/word/2010/wordprocessingGroup" xmlns:wpi="http://schemas.microsoft.com/office/word/2010/wordprocessingInk" xmlns:wne="http://schemas.microsoft.com/office/word/2006/wordml" xmlns:wps="http://schemas.microsoft.com/office/word/2010/wordprocessingShape" mc:Ignorable="w14 w15 w16se w16cid w16 w16cex w16sdtdh wp14">
   <w:abstractNum w:abstractNumId="0" w15:restartNumberingAfterBreak="0">
-    <w:nsid w:val="63D52F01"/>
+    <w:nsid w:val="30491934"/>
     <w:multiLevelType w:val="hybridMultilevel"/>
-    <w:tmpl w:val="050CFE2A"/>
-    <w:lvl w:ilvl="0" w:tplc="4DE0F3FA">
+    <w:tmpl w:val="278469F0"/>
+    <w:lvl w:ilvl="0" w:tplc="B47A567C">
       <w:start w:val="1"/>
       <w:numFmt w:val="bullet"/>
       <w:lvlText w:val="●"/>
@@ -17640,7 +18236,7 @@
         <w:ind w:left="720" w:hanging="360"/>
       </w:pPr>
     </w:lvl>
-    <w:lvl w:ilvl="1" w:tplc="825CA4BA">
+    <w:lvl w:ilvl="1" w:tplc="47E230EA">
       <w:start w:val="1"/>
       <w:numFmt w:val="bullet"/>
       <w:lvlText w:val="○"/>
@@ -17649,7 +18245,7 @@
         <w:ind w:left="1440" w:hanging="360"/>
       </w:pPr>
     </w:lvl>
-    <w:lvl w:ilvl="2" w:tplc="080061DA">
+    <w:lvl w:ilvl="2" w:tplc="FCB44A5A">
       <w:start w:val="1"/>
       <w:numFmt w:val="bullet"/>
       <w:lvlText w:val="■"/>
@@ -17658,7 +18254,7 @@
         <w:ind w:left="2160" w:hanging="360"/>
       </w:pPr>
     </w:lvl>
-    <w:lvl w:ilvl="3" w:tplc="48347C82">
+    <w:lvl w:ilvl="3" w:tplc="D69A6E44">
       <w:start w:val="1"/>
       <w:numFmt w:val="bullet"/>
       <w:lvlText w:val="●"/>
@@ -17667,7 +18263,7 @@
         <w:ind w:left="2880" w:hanging="360"/>
       </w:pPr>
     </w:lvl>
-    <w:lvl w:ilvl="4" w:tplc="26723500">
+    <w:lvl w:ilvl="4" w:tplc="838863BE">
       <w:start w:val="1"/>
       <w:numFmt w:val="bullet"/>
       <w:lvlText w:val="○"/>
@@ -17676,7 +18272,7 @@
         <w:ind w:left="3600" w:hanging="360"/>
       </w:pPr>
     </w:lvl>
-    <w:lvl w:ilvl="5" w:tplc="922627D4">
+    <w:lvl w:ilvl="5" w:tplc="D87C9D1E">
       <w:start w:val="1"/>
       <w:numFmt w:val="bullet"/>
       <w:lvlText w:val="■"/>
@@ -17685,7 +18281,7 @@
         <w:ind w:left="4320" w:hanging="360"/>
       </w:pPr>
     </w:lvl>
-    <w:lvl w:ilvl="6" w:tplc="43323C4A">
+    <w:lvl w:ilvl="6" w:tplc="36AE1DDC">
       <w:start w:val="1"/>
       <w:numFmt w:val="bullet"/>
       <w:lvlText w:val="●"/>
@@ -17694,7 +18290,7 @@
         <w:ind w:left="5040" w:hanging="360"/>
       </w:pPr>
     </w:lvl>
-    <w:lvl w:ilvl="7" w:tplc="3DD8DD40">
+    <w:lvl w:ilvl="7" w:tplc="D87A49BA">
       <w:start w:val="1"/>
       <w:numFmt w:val="bullet"/>
       <w:lvlText w:val="●"/>
@@ -17703,7 +18299,7 @@
         <w:ind w:left="5760" w:hanging="360"/>
       </w:pPr>
     </w:lvl>
-    <w:lvl w:ilvl="8" w:tplc="8BAA8064">
+    <w:lvl w:ilvl="8" w:tplc="FCA008A8">
       <w:start w:val="1"/>
       <w:numFmt w:val="bullet"/>
       <w:lvlText w:val="●"/>

</xml_diff>